<commit_message>
Refine public resume layout
</commit_message>
<xml_diff>
--- a/assets/docs/임소희_콘텐츠기획운영마케터_이력서.docx
+++ b/assets/docs/임소희_콘텐츠기획운영마케터_이력서.docx
@@ -4,10 +4,11 @@
   <w:body>
     <w:tbl>
       <w:tblPr>
-        <w:tblW w:type="auto" w:w="0"/>
-        <w:jc w:val="center"/>
+        <w:tblW w:type="dxa" w:w="9740"/>
+        <w:jc w:val="left"/>
         <w:tblLayout w:type="fixed"/>
         <w:tblLook w:firstColumn="1" w:firstRow="1" w:lastColumn="0" w:lastRow="0" w:noHBand="0" w:noVBand="1" w:val="04A0"/>
+        <w:tblInd w:w="0" w:type="dxa"/>
         <w:tblBorders>
           <w:top w:val="nil"/>
           <w:left w:val="nil"/>
@@ -18,49 +19,43 @@
         </w:tblBorders>
       </w:tblPr>
       <w:tblGrid>
-        <w:gridCol w:w="4989"/>
-        <w:gridCol w:w="4989"/>
+        <w:gridCol w:w="8200"/>
+        <w:gridCol w:w="1540"/>
       </w:tblGrid>
       <w:tr>
         <w:tc>
           <w:tcPr>
-            <w:tcW w:type="dxa" w:w="7880"/>
+            <w:tcW w:type="dxa" w:w="8200"/>
             <w:tcMar>
               <w:top w:w="0" w:type="dxa"/>
               <w:start w:w="0" w:type="dxa"/>
               <w:bottom w:w="0" w:type="dxa"/>
-              <w:end w:w="250" w:type="dxa"/>
+              <w:end w:w="120" w:type="dxa"/>
             </w:tcMar>
             <w:vAlign w:val="center"/>
           </w:tcPr>
           <w:p>
             <w:pPr>
-              <w:keepLines w:val="0"/>
-              <w:spacing w:before="0" w:after="20" w:line="240" w:lineRule="auto"/>
-              <w:jc w:val="left"/>
+              <w:spacing w:after="40"/>
             </w:pPr>
             <w:r>
               <w:rPr>
                 <w:rFonts w:ascii="Malgun Gothic" w:hAnsi="Malgun Gothic" w:eastAsia="Malgun Gothic"/>
                 <w:b/>
-                <w:i w:val="0"/>
-                <w:color w:val="111318"/>
-                <w:sz w:val="54"/>
+                <w:color w:val="13161C"/>
+                <w:sz w:val="50"/>
               </w:rPr>
               <w:t>임소희</w:t>
             </w:r>
           </w:p>
           <w:p>
             <w:pPr>
-              <w:keepLines w:val="0"/>
-              <w:spacing w:before="0" w:after="140" w:line="240" w:lineRule="auto"/>
-              <w:jc w:val="left"/>
+              <w:spacing w:after="140"/>
             </w:pPr>
             <w:r>
               <w:rPr>
                 <w:rFonts w:ascii="Malgun Gothic" w:hAnsi="Malgun Gothic" w:eastAsia="Malgun Gothic"/>
                 <w:b/>
-                <w:i w:val="0"/>
                 <w:color w:val="3264F5"/>
                 <w:sz w:val="24"/>
               </w:rPr>
@@ -69,17 +64,15 @@
           </w:p>
           <w:p>
             <w:pPr>
-              <w:keepLines w:val="0"/>
-              <w:spacing w:before="0" w:after="0" w:line="264" w:lineRule="auto"/>
-              <w:jc w:val="left"/>
+              <w:pStyle w:val="ResumeMeta"/>
             </w:pPr>
             <w:hyperlink r:id="rId10">
               <w:r>
                 <w:rPr>
                   <w:rFonts w:ascii="Malgun Gothic" w:hAnsi="Malgun Gothic" w:eastAsia="Malgun Gothic"/>
-                  <w:color w:val="686D78"/>
-                  <w:sz w:val="17"/>
-                  <w:szCs w:val="17"/>
+                  <w:color w:val="646872"/>
+                  <w:sz w:val="18"/>
+                  <w:szCs w:val="18"/>
                 </w:rPr>
                 <w:t>sohee.lim.lsh@gmail.com</w:t>
               </w:r>
@@ -87,10 +80,8 @@
             <w:r>
               <w:rPr>
                 <w:rFonts w:ascii="Malgun Gothic" w:hAnsi="Malgun Gothic" w:eastAsia="Malgun Gothic"/>
-                <w:b w:val="0"/>
-                <w:i w:val="0"/>
-                <w:color w:val="686D78"/>
-                <w:sz w:val="17"/>
+                <w:color w:val="D9DEE8"/>
+                <w:sz w:val="18"/>
               </w:rPr>
               <w:t xml:space="preserve">  ·  </w:t>
             </w:r>
@@ -98,9 +89,9 @@
               <w:r>
                 <w:rPr>
                   <w:rFonts w:ascii="Malgun Gothic" w:hAnsi="Malgun Gothic" w:eastAsia="Malgun Gothic"/>
-                  <w:color w:val="686D78"/>
-                  <w:sz w:val="17"/>
-                  <w:szCs w:val="17"/>
+                  <w:color w:val="646872"/>
+                  <w:sz w:val="18"/>
+                  <w:szCs w:val="18"/>
                 </w:rPr>
                 <w:t>LinkedIn</w:t>
               </w:r>
@@ -108,10 +99,8 @@
             <w:r>
               <w:rPr>
                 <w:rFonts w:ascii="Malgun Gothic" w:hAnsi="Malgun Gothic" w:eastAsia="Malgun Gothic"/>
-                <w:b w:val="0"/>
-                <w:i w:val="0"/>
-                <w:color w:val="686D78"/>
-                <w:sz w:val="17"/>
+                <w:color w:val="D9DEE8"/>
+                <w:sz w:val="18"/>
               </w:rPr>
               <w:t xml:space="preserve">  ·  </w:t>
             </w:r>
@@ -119,9 +108,10 @@
               <w:r>
                 <w:rPr>
                   <w:rFonts w:ascii="Malgun Gothic" w:hAnsi="Malgun Gothic" w:eastAsia="Malgun Gothic"/>
-                  <w:color w:val="686D78"/>
-                  <w:sz w:val="17"/>
-                  <w:szCs w:val="17"/>
+                  <w:color w:val="3264F5"/>
+                  <w:sz w:val="18"/>
+                  <w:szCs w:val="18"/>
+                  <w:b/>
                 </w:rPr>
                 <w:t>Portfolio</w:t>
               </w:r>
@@ -130,25 +120,24 @@
         </w:tc>
         <w:tc>
           <w:tcPr>
-            <w:tcW w:type="dxa" w:w="2097"/>
+            <w:tcW w:type="dxa" w:w="1540"/>
             <w:tcMar>
               <w:top w:w="0" w:type="dxa"/>
-              <w:start w:w="100" w:type="dxa"/>
+              <w:start w:w="120" w:type="dxa"/>
               <w:bottom w:w="0" w:type="dxa"/>
               <w:end w:w="0" w:type="dxa"/>
             </w:tcMar>
+            <w:vAlign w:val="top"/>
           </w:tcPr>
           <w:p>
             <w:pPr>
-              <w:keepLines w:val="0"/>
-              <w:spacing w:before="0" w:after="0" w:line="240" w:lineRule="auto"/>
               <w:jc w:val="right"/>
             </w:pPr>
             <w:r>
               <w:drawing>
                 <wp:inline xmlns:a="http://schemas.openxmlformats.org/drawingml/2006/main" xmlns:pic="http://schemas.openxmlformats.org/drawingml/2006/picture">
-                  <wp:extent cx="1044000" cy="1382400"/>
-                  <wp:docPr id="1" name="Picture 1" descr="임소희 프로필 사진" title="프로필 사진"/>
+                  <wp:extent cx="972000" cy="1285480"/>
+                  <wp:docPr id="1" name="Picture 1" descr="임소희 프로필 사진"/>
                   <wp:cNvGraphicFramePr>
                     <a:graphicFrameLocks noChangeAspect="1"/>
                   </wp:cNvGraphicFramePr>
@@ -156,7 +145,7 @@
                     <a:graphicData uri="http://schemas.openxmlformats.org/drawingml/2006/picture">
                       <pic:pic>
                         <pic:nvPicPr>
-                          <pic:cNvPr id="0" name="image.jpg"/>
+                          <pic:cNvPr id="0" name="profile.jpg"/>
                           <pic:cNvPicPr/>
                         </pic:nvPicPr>
                         <pic:blipFill>
@@ -168,7 +157,7 @@
                         <pic:spPr>
                           <a:xfrm>
                             <a:off x="0" y="0"/>
-                            <a:ext cx="1044000" cy="1382400"/>
+                            <a:ext cx="972000" cy="1285480"/>
                           </a:xfrm>
                           <a:prstGeom prst="rect"/>
                         </pic:spPr>
@@ -184,1779 +173,684 @@
     </w:tbl>
     <w:p>
       <w:pPr>
-        <w:keepLines/>
-        <w:spacing w:before="140" w:after="160" w:line="307" w:lineRule="auto"/>
-        <w:jc w:val="left"/>
+        <w:spacing w:before="400" w:after="440" w:line="348" w:lineRule="auto"/>
       </w:pPr>
       <w:r>
         <w:rPr>
           <w:rFonts w:ascii="Malgun Gothic" w:hAnsi="Malgun Gothic" w:eastAsia="Malgun Gothic"/>
           <w:b/>
-          <w:i w:val="0"/>
-          <w:color w:val="111318"/>
+          <w:color w:val="13161C"/>
           <w:sz w:val="21"/>
         </w:rPr>
-        <w:t xml:space="preserve">복잡한 정보를 이해하기 쉬운 콘텐츠로 바꾸고, 기획부터 제작·운영까지 연결합니다. </w:t>
+        <w:t>복잡한 정보를 목적과 독자에 맞게 구조화하고, 콘텐츠 기획부터 제작·검수·운영까지 연결합니다.</w:t>
+        <w:br/>
       </w:r>
       <w:r>
         <w:rPr>
           <w:rFonts w:ascii="Malgun Gothic" w:hAnsi="Malgun Gothic" w:eastAsia="Malgun Gothic"/>
           <w:b w:val="0"/>
-          <w:i w:val="0"/>
-          <w:color w:val="111318"/>
-          <w:sz w:val="20"/>
+          <w:color w:val="13161C"/>
+          <w:sz w:val="21"/>
         </w:rPr>
-        <w:t>SNS·SEO 콘텐츠와 사업 문서, 영상·전시 콘텐츠를 만들고 반복 제작 과정은 검수 기준과 운영 절차로 정리해 왔습니다.</w:t>
+        <w:t>SNS·SEO 콘텐츠와 사업계획서·제안서, 영상·전시 콘텐츠를 직접 구현해 왔습니다.</w:t>
+        <w:br/>
+      </w:r>
+      <w:r>
+        <w:rPr>
+          <w:rFonts w:ascii="Malgun Gothic" w:hAnsi="Malgun Gothic" w:eastAsia="Malgun Gothic"/>
+          <w:b w:val="0"/>
+          <w:color w:val="13161C"/>
+          <w:sz w:val="21"/>
+        </w:rPr>
+        <w:t>반복 업무에는 AI와 자동화를 활용하되 출처 확인과 최종 검수는 직접 진행합니다.</w:t>
       </w:r>
     </w:p>
     <w:p>
       <w:pPr>
-        <w:keepLines/>
-        <w:spacing w:before="160" w:after="120" w:line="240" w:lineRule="auto"/>
-        <w:jc w:val="left"/>
-        <w:pBdr>
-          <w:bottom w:val="single" w:sz="10" w:space="4" w:color="3264F5"/>
-        </w:pBdr>
+        <w:pStyle w:val="Heading1"/>
+        <w:pageBreakBefore w:val="0"/>
       </w:pPr>
       <w:r>
         <w:rPr>
-          <w:rFonts w:ascii="Arial" w:hAnsi="Arial" w:eastAsia="Arial"/>
+          <w:rFonts w:ascii="Malgun Gothic" w:hAnsi="Malgun Gothic" w:eastAsia="Malgun Gothic"/>
           <w:b/>
-          <w:i w:val="0"/>
           <w:color w:val="3264F5"/>
-          <w:sz w:val="16"/>
+          <w:sz w:val="25"/>
         </w:rPr>
-        <w:t>SELECTED RESULTS</w:t>
+        <w:t>CORE SKILLS</w:t>
       </w:r>
     </w:p>
-    <w:tbl>
-      <w:tblPr>
-        <w:tblW w:type="auto" w:w="0"/>
-        <w:jc w:val="center"/>
-        <w:tblLayout w:type="fixed"/>
-        <w:tblLook w:firstColumn="1" w:firstRow="1" w:lastColumn="0" w:lastRow="0" w:noHBand="0" w:noVBand="1" w:val="04A0"/>
-        <w:tblBorders>
-          <w:top w:val="nil"/>
-          <w:left w:val="nil"/>
-          <w:bottom w:val="nil"/>
-          <w:right w:val="nil"/>
-          <w:insideH w:val="nil"/>
-          <w:insideV w:val="nil"/>
-        </w:tblBorders>
-      </w:tblPr>
-      <w:tblGrid>
-        <w:gridCol w:w="3326"/>
-        <w:gridCol w:w="3326"/>
-        <w:gridCol w:w="3326"/>
-      </w:tblGrid>
-      <w:tr>
-        <w:tc>
-          <w:tcPr>
-            <w:tcW w:type="dxa" w:w="3327"/>
-            <w:shd w:fill="EEF1FA"/>
-            <w:tcMar>
-              <w:top w:w="150" w:type="dxa"/>
-              <w:start w:w="180" w:type="dxa"/>
-              <w:bottom w:w="150" w:type="dxa"/>
-              <w:end w:w="180" w:type="dxa"/>
-            </w:tcMar>
-            <w:vAlign w:val="center"/>
-            <w:tcBorders>
-              <w:right w:val="single" w:sz="8" w:color="FFFFFF"/>
-            </w:tcBorders>
-          </w:tcPr>
-          <w:p>
-            <w:pPr>
-              <w:keepLines w:val="0"/>
-              <w:spacing w:before="0" w:after="40" w:line="240" w:lineRule="auto"/>
-              <w:jc w:val="left"/>
-            </w:pPr>
-            <w:r>
-              <w:rPr>
-                <w:rFonts w:ascii="Malgun Gothic" w:hAnsi="Malgun Gothic" w:eastAsia="Malgun Gothic"/>
-                <w:b/>
-                <w:i w:val="0"/>
-                <w:color w:val="3264F5"/>
-                <w:sz w:val="35"/>
-              </w:rPr>
-              <w:t>4,500만 원</w:t>
-            </w:r>
-          </w:p>
-          <w:p>
-            <w:pPr>
-              <w:keepLines w:val="0"/>
-              <w:spacing w:before="0" w:after="40" w:line="264" w:lineRule="auto"/>
-              <w:jc w:val="left"/>
-            </w:pPr>
-            <w:r>
-              <w:rPr>
-                <w:rFonts w:ascii="Malgun Gothic" w:hAnsi="Malgun Gothic" w:eastAsia="Malgun Gothic"/>
-                <w:b/>
-                <w:i w:val="0"/>
-                <w:color w:val="111318"/>
-                <w:sz w:val="18"/>
-              </w:rPr>
-              <w:t>수출바우처 사업 선정</w:t>
-            </w:r>
-          </w:p>
-          <w:p>
-            <w:pPr>
-              <w:keepLines w:val="0"/>
-              <w:spacing w:before="0" w:after="0" w:line="276" w:lineRule="auto"/>
-              <w:jc w:val="left"/>
-            </w:pPr>
-            <w:r>
-              <w:rPr>
-                <w:rFonts w:ascii="Malgun Gothic" w:hAnsi="Malgun Gothic" w:eastAsia="Malgun Gothic"/>
-                <w:b w:val="0"/>
-                <w:i w:val="0"/>
-                <w:color w:val="686D78"/>
-                <w:sz w:val="15"/>
-              </w:rPr>
-              <w:t>시장 조사부터 사업계획서 구조 설계·작성</w:t>
-            </w:r>
-          </w:p>
-        </w:tc>
-        <w:tc>
-          <w:tcPr>
-            <w:tcW w:type="dxa" w:w="3327"/>
-            <w:shd w:fill="EEF1FA"/>
-            <w:tcMar>
-              <w:top w:w="150" w:type="dxa"/>
-              <w:start w:w="180" w:type="dxa"/>
-              <w:bottom w:w="150" w:type="dxa"/>
-              <w:end w:w="180" w:type="dxa"/>
-            </w:tcMar>
-            <w:vAlign w:val="center"/>
-            <w:tcBorders>
-              <w:right w:val="single" w:sz="8" w:color="FFFFFF"/>
-            </w:tcBorders>
-          </w:tcPr>
-          <w:p>
-            <w:pPr>
-              <w:keepLines w:val="0"/>
-              <w:spacing w:before="0" w:after="40" w:line="240" w:lineRule="auto"/>
-              <w:jc w:val="left"/>
-            </w:pPr>
-            <w:r>
-              <w:rPr>
-                <w:rFonts w:ascii="Malgun Gothic" w:hAnsi="Malgun Gothic" w:eastAsia="Malgun Gothic"/>
-                <w:b/>
-                <w:i w:val="0"/>
-                <w:color w:val="3264F5"/>
-                <w:sz w:val="35"/>
-              </w:rPr>
-              <w:t>9 / 10</w:t>
-            </w:r>
-          </w:p>
-          <w:p>
-            <w:pPr>
-              <w:keepLines w:val="0"/>
-              <w:spacing w:before="0" w:after="40" w:line="264" w:lineRule="auto"/>
-              <w:jc w:val="left"/>
-            </w:pPr>
-            <w:r>
-              <w:rPr>
-                <w:rFonts w:ascii="Malgun Gothic" w:hAnsi="Malgun Gothic" w:eastAsia="Malgun Gothic"/>
-                <w:b/>
-                <w:i w:val="0"/>
-                <w:color w:val="111318"/>
-                <w:sz w:val="18"/>
-              </w:rPr>
-              <w:t>추적 키워드 검색 5위 이내</w:t>
-            </w:r>
-          </w:p>
-          <w:p>
-            <w:pPr>
-              <w:keepLines w:val="0"/>
-              <w:spacing w:before="0" w:after="0" w:line="276" w:lineRule="auto"/>
-              <w:jc w:val="left"/>
-            </w:pPr>
-            <w:r>
-              <w:rPr>
-                <w:rFonts w:ascii="Malgun Gothic" w:hAnsi="Malgun Gothic" w:eastAsia="Malgun Gothic"/>
-                <w:b w:val="0"/>
-                <w:i w:val="0"/>
-                <w:color w:val="686D78"/>
-                <w:sz w:val="15"/>
-              </w:rPr>
-              <w:t>10개 모두 노출 · 5개 검색 1위</w:t>
-            </w:r>
-          </w:p>
-        </w:tc>
-        <w:tc>
-          <w:tcPr>
-            <w:tcW w:type="dxa" w:w="3322"/>
-            <w:shd w:fill="EEF1FA"/>
-            <w:tcMar>
-              <w:top w:w="150" w:type="dxa"/>
-              <w:start w:w="180" w:type="dxa"/>
-              <w:bottom w:w="150" w:type="dxa"/>
-              <w:end w:w="180" w:type="dxa"/>
-            </w:tcMar>
-            <w:vAlign w:val="center"/>
-          </w:tcPr>
-          <w:p>
-            <w:pPr>
-              <w:keepLines w:val="0"/>
-              <w:spacing w:before="0" w:after="40" w:line="240" w:lineRule="auto"/>
-              <w:jc w:val="left"/>
-            </w:pPr>
-            <w:r>
-              <w:rPr>
-                <w:rFonts w:ascii="Malgun Gothic" w:hAnsi="Malgun Gothic" w:eastAsia="Malgun Gothic"/>
-                <w:b/>
-                <w:i w:val="0"/>
-                <w:color w:val="3264F5"/>
-                <w:sz w:val="35"/>
-              </w:rPr>
-              <w:t>230 · 170 · 37</w:t>
-            </w:r>
-          </w:p>
-          <w:p>
-            <w:pPr>
-              <w:keepLines w:val="0"/>
-              <w:spacing w:before="0" w:after="40" w:line="264" w:lineRule="auto"/>
-              <w:jc w:val="left"/>
-            </w:pPr>
-            <w:r>
-              <w:rPr>
-                <w:rFonts w:ascii="Malgun Gothic" w:hAnsi="Malgun Gothic" w:eastAsia="Malgun Gothic"/>
-                <w:b/>
-                <w:i w:val="0"/>
-                <w:color w:val="111318"/>
-                <w:sz w:val="18"/>
-              </w:rPr>
-              <w:t>HP 공동 웨비나</w:t>
-            </w:r>
-          </w:p>
-          <w:p>
-            <w:pPr>
-              <w:keepLines w:val="0"/>
-              <w:spacing w:before="0" w:after="0" w:line="276" w:lineRule="auto"/>
-              <w:jc w:val="left"/>
-            </w:pPr>
-            <w:r>
-              <w:rPr>
-                <w:rFonts w:ascii="Malgun Gothic" w:hAnsi="Malgun Gothic" w:eastAsia="Malgun Gothic"/>
-                <w:b w:val="0"/>
-                <w:i w:val="0"/>
-                <w:color w:val="686D78"/>
-                <w:sz w:val="15"/>
-              </w:rPr>
-              <w:t>등록 · 실시간 참석 · 후속 신청</w:t>
-            </w:r>
-          </w:p>
-        </w:tc>
-      </w:tr>
-    </w:tbl>
     <w:p>
       <w:pPr>
-        <w:keepLines/>
-        <w:spacing w:before="160" w:after="80" w:line="240" w:lineRule="auto"/>
-        <w:jc w:val="left"/>
-        <w:pBdr>
-          <w:bottom w:val="single" w:sz="10" w:space="4" w:color="3264F5"/>
-        </w:pBdr>
+        <w:spacing w:after="380" w:line="324" w:lineRule="auto"/>
       </w:pPr>
       <w:r>
         <w:rPr>
-          <w:rFonts w:ascii="Arial" w:hAnsi="Arial" w:eastAsia="Arial"/>
+          <w:rFonts w:ascii="Malgun Gothic" w:hAnsi="Malgun Gothic" w:eastAsia="Malgun Gothic"/>
           <w:b/>
-          <w:i w:val="0"/>
+          <w:color w:val="646872"/>
+          <w:sz w:val="20"/>
+        </w:rPr>
+        <w:t>콘텐츠 기획·운영  ·  SNS·SEO  ·  사업계획서·제안서  ·  발표자료  ·  영상·전시  ·  AI 워크플로</w:t>
+      </w:r>
+    </w:p>
+    <w:p>
+      <w:pPr>
+        <w:pStyle w:val="Heading1"/>
+        <w:pageBreakBefore w:val="0"/>
+      </w:pPr>
+      <w:r>
+        <w:rPr>
+          <w:rFonts w:ascii="Malgun Gothic" w:hAnsi="Malgun Gothic" w:eastAsia="Malgun Gothic"/>
+          <w:b/>
           <w:color w:val="3264F5"/>
-          <w:sz w:val="16"/>
+          <w:sz w:val="25"/>
         </w:rPr>
         <w:t>EXPERIENCE</w:t>
       </w:r>
     </w:p>
-    <w:tbl>
-      <w:tblPr>
-        <w:tblW w:type="auto" w:w="0"/>
-        <w:jc w:val="center"/>
-        <w:tblLayout w:type="fixed"/>
-        <w:tblLook w:firstColumn="1" w:firstRow="1" w:lastColumn="0" w:lastRow="0" w:noHBand="0" w:noVBand="1" w:val="04A0"/>
-        <w:tblBorders>
-          <w:top w:val="nil"/>
-          <w:left w:val="nil"/>
-          <w:bottom w:val="nil"/>
-          <w:right w:val="nil"/>
-          <w:insideH w:val="nil"/>
-          <w:insideV w:val="nil"/>
-        </w:tblBorders>
-      </w:tblPr>
-      <w:tblGrid>
-        <w:gridCol w:w="4989"/>
-        <w:gridCol w:w="4989"/>
-      </w:tblGrid>
-      <w:tr>
-        <w:tc>
-          <w:tcPr>
-            <w:tcW w:type="dxa" w:w="1757"/>
-            <w:tcMar>
-              <w:top w:w="70" w:type="dxa"/>
-              <w:start w:w="0" w:type="dxa"/>
-              <w:bottom w:w="100" w:type="dxa"/>
-              <w:end w:w="140" w:type="dxa"/>
-            </w:tcMar>
-          </w:tcPr>
-          <w:p>
-            <w:pPr>
-              <w:keepLines w:val="0"/>
-              <w:spacing w:before="0" w:after="0" w:line="264" w:lineRule="auto"/>
-              <w:jc w:val="left"/>
-            </w:pPr>
-            <w:r>
-              <w:rPr>
-                <w:rFonts w:ascii="Malgun Gothic" w:hAnsi="Malgun Gothic" w:eastAsia="Malgun Gothic"/>
-                <w:b/>
-                <w:i w:val="0"/>
-                <w:color w:val="3264F5"/>
-                <w:sz w:val="16"/>
-              </w:rPr>
-              <w:t>2024.06–현재</w:t>
-            </w:r>
-          </w:p>
-        </w:tc>
-        <w:tc>
-          <w:tcPr>
-            <w:tcW w:type="dxa" w:w="8220"/>
-            <w:tcMar>
-              <w:top w:w="70" w:type="dxa"/>
-              <w:start w:w="0" w:type="dxa"/>
-              <w:bottom w:w="100" w:type="dxa"/>
-              <w:end w:w="0" w:type="dxa"/>
-            </w:tcMar>
-            <w:tcBorders>
-              <w:bottom w:val="single" w:sz="4" w:color="D9DDE7"/>
-            </w:tcBorders>
-          </w:tcPr>
-          <w:p>
-            <w:pPr>
-              <w:keepLines w:val="0"/>
-              <w:spacing w:before="0" w:after="20" w:line="252" w:lineRule="auto"/>
-              <w:jc w:val="left"/>
-            </w:pPr>
-            <w:r>
-              <w:rPr>
-                <w:rFonts w:ascii="Malgun Gothic" w:hAnsi="Malgun Gothic" w:eastAsia="Malgun Gothic"/>
-                <w:b/>
-                <w:i w:val="0"/>
-                <w:color w:val="111318"/>
-                <w:sz w:val="20"/>
-              </w:rPr>
-              <w:t>주식회사 더프라임그룹</w:t>
-            </w:r>
-            <w:r>
-              <w:rPr>
-                <w:rFonts w:ascii="Malgun Gothic" w:hAnsi="Malgun Gothic" w:eastAsia="Malgun Gothic"/>
-                <w:b w:val="0"/>
-                <w:i w:val="0"/>
-                <w:color w:val="686D78"/>
-                <w:sz w:val="16"/>
-              </w:rPr>
-              <w:t xml:space="preserve">  콘텐츠 마케팅</w:t>
-            </w:r>
-          </w:p>
-          <w:p>
-            <w:pPr>
-              <w:keepLines w:val="0"/>
-              <w:spacing w:before="0" w:after="20" w:line="281" w:lineRule="auto"/>
-              <w:jc w:val="left"/>
-            </w:pPr>
-            <w:r>
-              <w:rPr>
-                <w:rFonts w:ascii="Malgun Gothic" w:hAnsi="Malgun Gothic" w:eastAsia="Malgun Gothic"/>
-                <w:b w:val="0"/>
-                <w:i w:val="0"/>
-                <w:color w:val="111318"/>
-                <w:sz w:val="17"/>
-              </w:rPr>
-              <w:t>네이버 블로그·YouTube·Instagram·LinkedIn 콘텐츠를 기획·제작·발행하고, 사업계획서·제안서와 발표 자료를 작성했습니다. 전시 부스와 현장 콘텐츠를 기획하고 외부 제작 일정과 결과물을 확인했습니다.</w:t>
-            </w:r>
-          </w:p>
-          <w:p>
-            <w:pPr>
-              <w:keepLines w:val="0"/>
-              <w:spacing w:before="0" w:after="0" w:line="281" w:lineRule="auto"/>
-              <w:jc w:val="left"/>
-            </w:pPr>
-            <w:r>
-              <w:rPr>
-                <w:rFonts w:ascii="Malgun Gothic" w:hAnsi="Malgun Gothic" w:eastAsia="Malgun Gothic"/>
-                <w:b w:val="0"/>
-                <w:i w:val="0"/>
-                <w:color w:val="111318"/>
-                <w:sz w:val="17"/>
-              </w:rPr>
-              <w:t>AI를 활용한 블로그 반복 제작과 검수 흐름을 구축하고, 매주 검색 순위를 점검해 다음 주제와 보완 키워드에 반영했습니다.</w:t>
-            </w:r>
-          </w:p>
-        </w:tc>
-      </w:tr>
-    </w:tbl>
-    <w:tbl>
-      <w:tblPr>
-        <w:tblW w:type="auto" w:w="0"/>
-        <w:jc w:val="center"/>
-        <w:tblLayout w:type="fixed"/>
-        <w:tblLook w:firstColumn="1" w:firstRow="1" w:lastColumn="0" w:lastRow="0" w:noHBand="0" w:noVBand="1" w:val="04A0"/>
-        <w:tblBorders>
-          <w:top w:val="nil"/>
-          <w:left w:val="nil"/>
-          <w:bottom w:val="nil"/>
-          <w:right w:val="nil"/>
-          <w:insideH w:val="nil"/>
-          <w:insideV w:val="nil"/>
-        </w:tblBorders>
-      </w:tblPr>
-      <w:tblGrid>
-        <w:gridCol w:w="4989"/>
-        <w:gridCol w:w="4989"/>
-      </w:tblGrid>
-      <w:tr>
-        <w:tc>
-          <w:tcPr>
-            <w:tcW w:type="dxa" w:w="1757"/>
-            <w:tcMar>
-              <w:top w:w="70" w:type="dxa"/>
-              <w:start w:w="0" w:type="dxa"/>
-              <w:bottom w:w="100" w:type="dxa"/>
-              <w:end w:w="140" w:type="dxa"/>
-            </w:tcMar>
-          </w:tcPr>
-          <w:p>
-            <w:pPr>
-              <w:keepLines w:val="0"/>
-              <w:spacing w:before="0" w:after="0" w:line="264" w:lineRule="auto"/>
-              <w:jc w:val="left"/>
-            </w:pPr>
-            <w:r>
-              <w:rPr>
-                <w:rFonts w:ascii="Malgun Gothic" w:hAnsi="Malgun Gothic" w:eastAsia="Malgun Gothic"/>
-                <w:b/>
-                <w:i w:val="0"/>
-                <w:color w:val="3264F5"/>
-                <w:sz w:val="16"/>
-              </w:rPr>
-              <w:t>2022.11–2023.11</w:t>
-            </w:r>
-          </w:p>
-        </w:tc>
-        <w:tc>
-          <w:tcPr>
-            <w:tcW w:type="dxa" w:w="8220"/>
-            <w:tcMar>
-              <w:top w:w="70" w:type="dxa"/>
-              <w:start w:w="0" w:type="dxa"/>
-              <w:bottom w:w="100" w:type="dxa"/>
-              <w:end w:w="0" w:type="dxa"/>
-            </w:tcMar>
-            <w:tcBorders>
-              <w:bottom w:val="single" w:sz="4" w:color="D9DDE7"/>
-            </w:tcBorders>
-          </w:tcPr>
-          <w:p>
-            <w:pPr>
-              <w:keepLines w:val="0"/>
-              <w:spacing w:before="0" w:after="20" w:line="252" w:lineRule="auto"/>
-              <w:jc w:val="left"/>
-            </w:pPr>
-            <w:r>
-              <w:rPr>
-                <w:rFonts w:ascii="Malgun Gothic" w:hAnsi="Malgun Gothic" w:eastAsia="Malgun Gothic"/>
-                <w:b/>
-                <w:i w:val="0"/>
-                <w:color w:val="111318"/>
-                <w:sz w:val="20"/>
-              </w:rPr>
-              <w:t>주식회사 푸딩</w:t>
-            </w:r>
-            <w:r>
-              <w:rPr>
-                <w:rFonts w:ascii="Malgun Gothic" w:hAnsi="Malgun Gothic" w:eastAsia="Malgun Gothic"/>
-                <w:b w:val="0"/>
-                <w:i w:val="0"/>
-                <w:color w:val="686D78"/>
-                <w:sz w:val="16"/>
-              </w:rPr>
-              <w:t xml:space="preserve">  그래픽팀</w:t>
-            </w:r>
-          </w:p>
-          <w:p>
-            <w:pPr>
-              <w:keepLines w:val="0"/>
-              <w:spacing w:before="0" w:after="20" w:line="281" w:lineRule="auto"/>
-              <w:jc w:val="left"/>
-            </w:pPr>
-            <w:r>
-              <w:rPr>
-                <w:rFonts w:ascii="Malgun Gothic" w:hAnsi="Malgun Gothic" w:eastAsia="Malgun Gothic"/>
-                <w:b w:val="0"/>
-                <w:i w:val="0"/>
-                <w:color w:val="111318"/>
-                <w:sz w:val="17"/>
-              </w:rPr>
-              <w:t>웹페이지와 그래픽 결과물을 제작하며 콘텐츠 제작에 필요한 시각 구성과 디자인 실무의 기반을 쌓았습니다.</w:t>
-            </w:r>
-          </w:p>
-        </w:tc>
-      </w:tr>
-    </w:tbl>
-    <w:tbl>
-      <w:tblPr>
-        <w:tblW w:type="auto" w:w="0"/>
-        <w:jc w:val="center"/>
-        <w:tblLayout w:type="fixed"/>
-        <w:tblLook w:firstColumn="1" w:firstRow="1" w:lastColumn="0" w:lastRow="0" w:noHBand="0" w:noVBand="1" w:val="04A0"/>
-        <w:tblBorders>
-          <w:top w:val="nil"/>
-          <w:left w:val="nil"/>
-          <w:bottom w:val="nil"/>
-          <w:right w:val="nil"/>
-          <w:insideH w:val="nil"/>
-          <w:insideV w:val="nil"/>
-        </w:tblBorders>
-      </w:tblPr>
-      <w:tblGrid>
-        <w:gridCol w:w="4989"/>
-        <w:gridCol w:w="4989"/>
-      </w:tblGrid>
-      <w:tr>
-        <w:tc>
-          <w:tcPr>
-            <w:tcW w:type="dxa" w:w="1757"/>
-            <w:tcMar>
-              <w:top w:w="70" w:type="dxa"/>
-              <w:start w:w="0" w:type="dxa"/>
-              <w:bottom w:w="100" w:type="dxa"/>
-              <w:end w:w="140" w:type="dxa"/>
-            </w:tcMar>
-          </w:tcPr>
-          <w:p>
-            <w:pPr>
-              <w:keepLines w:val="0"/>
-              <w:spacing w:before="0" w:after="0" w:line="264" w:lineRule="auto"/>
-              <w:jc w:val="left"/>
-            </w:pPr>
-            <w:r>
-              <w:rPr>
-                <w:rFonts w:ascii="Malgun Gothic" w:hAnsi="Malgun Gothic" w:eastAsia="Malgun Gothic"/>
-                <w:b/>
-                <w:i w:val="0"/>
-                <w:color w:val="3264F5"/>
-                <w:sz w:val="16"/>
-              </w:rPr>
-              <w:t>2021.04–2022.04</w:t>
-            </w:r>
-          </w:p>
-        </w:tc>
-        <w:tc>
-          <w:tcPr>
-            <w:tcW w:type="dxa" w:w="8220"/>
-            <w:tcMar>
-              <w:top w:w="70" w:type="dxa"/>
-              <w:start w:w="0" w:type="dxa"/>
-              <w:bottom w:w="100" w:type="dxa"/>
-              <w:end w:w="0" w:type="dxa"/>
-            </w:tcMar>
-            <w:tcBorders>
-              <w:bottom w:val="single" w:sz="4" w:color="D9DDE7"/>
-            </w:tcBorders>
-          </w:tcPr>
-          <w:p>
-            <w:pPr>
-              <w:keepLines w:val="0"/>
-              <w:spacing w:before="0" w:after="20" w:line="252" w:lineRule="auto"/>
-              <w:jc w:val="left"/>
-            </w:pPr>
-            <w:r>
-              <w:rPr>
-                <w:rFonts w:ascii="Malgun Gothic" w:hAnsi="Malgun Gothic" w:eastAsia="Malgun Gothic"/>
-                <w:b/>
-                <w:i w:val="0"/>
-                <w:color w:val="111318"/>
-                <w:sz w:val="20"/>
-              </w:rPr>
-              <w:t>대구사이버대학교</w:t>
-            </w:r>
-            <w:r>
-              <w:rPr>
-                <w:rFonts w:ascii="Malgun Gothic" w:hAnsi="Malgun Gothic" w:eastAsia="Malgun Gothic"/>
-                <w:b w:val="0"/>
-                <w:i w:val="0"/>
-                <w:color w:val="686D78"/>
-                <w:sz w:val="16"/>
-              </w:rPr>
-              <w:t xml:space="preserve">  기획정보팀</w:t>
-            </w:r>
-          </w:p>
-          <w:p>
-            <w:pPr>
-              <w:keepLines w:val="0"/>
-              <w:spacing w:before="0" w:after="20" w:line="281" w:lineRule="auto"/>
-              <w:jc w:val="left"/>
-            </w:pPr>
-            <w:r>
-              <w:rPr>
-                <w:rFonts w:ascii="Malgun Gothic" w:hAnsi="Malgun Gothic" w:eastAsia="Malgun Gothic"/>
-                <w:b w:val="0"/>
-                <w:i w:val="0"/>
-                <w:color w:val="111318"/>
-                <w:sz w:val="17"/>
-              </w:rPr>
-              <w:t>웹디자인과 교내 디자인 실무를 담당하며 목적과 매체에 맞게 정보를 화면과 시각물로 구성했습니다.</w:t>
-            </w:r>
-          </w:p>
-        </w:tc>
-      </w:tr>
-    </w:tbl>
-    <w:tbl>
-      <w:tblPr>
-        <w:tblW w:type="auto" w:w="0"/>
-        <w:jc w:val="center"/>
-        <w:tblLayout w:type="fixed"/>
-        <w:tblLook w:firstColumn="1" w:firstRow="1" w:lastColumn="0" w:lastRow="0" w:noHBand="0" w:noVBand="1" w:val="04A0"/>
-        <w:tblBorders>
-          <w:top w:val="nil"/>
-          <w:left w:val="nil"/>
-          <w:bottom w:val="nil"/>
-          <w:right w:val="nil"/>
-          <w:insideH w:val="nil"/>
-          <w:insideV w:val="nil"/>
-        </w:tblBorders>
-      </w:tblPr>
-      <w:tblGrid>
-        <w:gridCol w:w="4989"/>
-        <w:gridCol w:w="4989"/>
-      </w:tblGrid>
-      <w:tr>
-        <w:tc>
-          <w:tcPr>
-            <w:tcW w:type="dxa" w:w="1757"/>
-            <w:tcMar>
-              <w:top w:w="70" w:type="dxa"/>
-              <w:start w:w="0" w:type="dxa"/>
-              <w:bottom w:w="100" w:type="dxa"/>
-              <w:end w:w="140" w:type="dxa"/>
-            </w:tcMar>
-          </w:tcPr>
-          <w:p>
-            <w:pPr>
-              <w:keepLines w:val="0"/>
-              <w:spacing w:before="0" w:after="0" w:line="264" w:lineRule="auto"/>
-              <w:jc w:val="left"/>
-            </w:pPr>
-            <w:r>
-              <w:rPr>
-                <w:rFonts w:ascii="Malgun Gothic" w:hAnsi="Malgun Gothic" w:eastAsia="Malgun Gothic"/>
-                <w:b/>
-                <w:i w:val="0"/>
-                <w:color w:val="3264F5"/>
-                <w:sz w:val="16"/>
-              </w:rPr>
-              <w:t>2014.05–2019.10</w:t>
-            </w:r>
-          </w:p>
-        </w:tc>
-        <w:tc>
-          <w:tcPr>
-            <w:tcW w:type="dxa" w:w="8220"/>
-            <w:tcMar>
-              <w:top w:w="70" w:type="dxa"/>
-              <w:start w:w="0" w:type="dxa"/>
-              <w:bottom w:w="100" w:type="dxa"/>
-              <w:end w:w="0" w:type="dxa"/>
-            </w:tcMar>
-          </w:tcPr>
-          <w:p>
-            <w:pPr>
-              <w:keepLines w:val="0"/>
-              <w:spacing w:before="0" w:after="20" w:line="252" w:lineRule="auto"/>
-              <w:jc w:val="left"/>
-            </w:pPr>
-            <w:r>
-              <w:rPr>
-                <w:rFonts w:ascii="Malgun Gothic" w:hAnsi="Malgun Gothic" w:eastAsia="Malgun Gothic"/>
-                <w:b/>
-                <w:i w:val="0"/>
-                <w:color w:val="111318"/>
-                <w:sz w:val="20"/>
-              </w:rPr>
-              <w:t>투썸플레이스 대구 영남대점</w:t>
-            </w:r>
-            <w:r>
-              <w:rPr>
-                <w:rFonts w:ascii="Malgun Gothic" w:hAnsi="Malgun Gothic" w:eastAsia="Malgun Gothic"/>
-                <w:b w:val="0"/>
-                <w:i w:val="0"/>
-                <w:color w:val="686D78"/>
-                <w:sz w:val="16"/>
-              </w:rPr>
-              <w:t xml:space="preserve">  매장 운영</w:t>
-            </w:r>
-          </w:p>
-          <w:p>
-            <w:pPr>
-              <w:keepLines w:val="0"/>
-              <w:spacing w:before="0" w:after="20" w:line="281" w:lineRule="auto"/>
-              <w:jc w:val="left"/>
-            </w:pPr>
-            <w:r>
-              <w:rPr>
-                <w:rFonts w:ascii="Malgun Gothic" w:hAnsi="Malgun Gothic" w:eastAsia="Malgun Gothic"/>
-                <w:b w:val="0"/>
-                <w:i w:val="0"/>
-                <w:color w:val="111318"/>
-                <w:sz w:val="17"/>
-              </w:rPr>
-              <w:t>고객 응대와 매장 운영을 맡으며 이용자 관점과 현장 운영 경험을 쌓았습니다.</w:t>
-            </w:r>
-          </w:p>
-        </w:tc>
-      </w:tr>
-    </w:tbl>
     <w:p>
       <w:pPr>
-        <w:keepLines/>
-        <w:spacing w:before="160" w:after="120" w:line="240" w:lineRule="auto"/>
-        <w:pBdr>
-          <w:bottom w:val="single" w:sz="10" w:space="4" w:color="3264F5"/>
-        </w:pBdr>
+        <w:keepNext/>
+        <w:tabs>
+          <w:tab w:pos="9694" w:val="right"/>
+        </w:tabs>
+        <w:spacing w:before="280" w:after="120"/>
       </w:pPr>
       <w:r>
         <w:rPr>
-          <w:rFonts w:ascii="Arial" w:hAnsi="Arial" w:eastAsia="Arial"/>
+          <w:rFonts w:ascii="Malgun Gothic" w:hAnsi="Malgun Gothic" w:eastAsia="Malgun Gothic"/>
           <w:b/>
-          <w:color w:val="3264F5"/>
-          <w:sz w:val="16"/>
+          <w:color w:val="13161C"/>
+          <w:sz w:val="22"/>
         </w:rPr>
-        <w:t>CORE CAPABILITIES</w:t>
+        <w:t>주식회사 더프라임그룹 | 콘텐츠 마케팅</w:t>
+      </w:r>
+      <w:r>
+        <w:rPr>
+          <w:rFonts w:ascii="Malgun Gothic" w:hAnsi="Malgun Gothic" w:eastAsia="Malgun Gothic"/>
+          <w:b/>
+          <w:color w:val="646872"/>
+          <w:sz w:val="19"/>
+        </w:rPr>
+        <w:tab/>
+        <w:t>2024.06–현재</w:t>
       </w:r>
     </w:p>
-    <w:tbl>
-      <w:tblPr>
-        <w:tblW w:type="auto" w:w="0"/>
-        <w:jc w:val="center"/>
-        <w:tblLayout w:type="fixed"/>
-        <w:tblLook w:firstColumn="1" w:firstRow="1" w:lastColumn="0" w:lastRow="0" w:noHBand="0" w:noVBand="1" w:val="04A0"/>
-        <w:tblBorders>
-          <w:top w:val="nil"/>
-          <w:left w:val="nil"/>
-          <w:bottom w:val="nil"/>
-          <w:right w:val="nil"/>
-          <w:insideH w:val="nil"/>
-          <w:insideV w:val="nil"/>
-        </w:tblBorders>
-      </w:tblPr>
-      <w:tblGrid>
-        <w:gridCol w:w="2494"/>
-        <w:gridCol w:w="2494"/>
-        <w:gridCol w:w="2494"/>
-        <w:gridCol w:w="2494"/>
-      </w:tblGrid>
-      <w:tr>
-        <w:tc>
-          <w:tcPr>
-            <w:tcW w:type="dxa" w:w="2494"/>
-            <w:tcMar>
-              <w:top w:w="120" w:type="dxa"/>
-              <w:start w:w="130" w:type="dxa"/>
-              <w:bottom w:w="120" w:type="dxa"/>
-              <w:end w:w="130" w:type="dxa"/>
-            </w:tcMar>
-            <w:shd w:fill="EEF1FA"/>
-            <w:vAlign w:val="center"/>
-            <w:tcBorders>
-              <w:right w:val="single" w:sz="5" w:color="D9DDE7"/>
-            </w:tcBorders>
-          </w:tcPr>
-          <w:p>
-            <w:pPr>
-              <w:keepLines/>
-              <w:spacing w:before="0" w:after="60" w:line="240" w:lineRule="auto"/>
-            </w:pPr>
-            <w:r>
-              <w:rPr>
-                <w:rFonts w:ascii="Malgun Gothic" w:hAnsi="Malgun Gothic" w:eastAsia="Malgun Gothic"/>
-                <w:b/>
-                <w:color w:val="3264F5"/>
-                <w:sz w:val="17"/>
-              </w:rPr>
-              <w:t>콘텐츠 운영</w:t>
-            </w:r>
-          </w:p>
-          <w:p>
-            <w:pPr>
-              <w:keepLines/>
-              <w:spacing w:before="0" w:after="0" w:line="281" w:lineRule="auto"/>
-            </w:pPr>
-            <w:r>
-              <w:rPr>
-                <w:rFonts w:ascii="Malgun Gothic" w:hAnsi="Malgun Gothic" w:eastAsia="Malgun Gothic"/>
-                <w:b w:val="0"/>
-                <w:color w:val="111318"/>
-                <w:sz w:val="15"/>
-              </w:rPr>
-              <w:t>SNS·SEO 콘텐츠 기획·제작·발행</w:t>
-            </w:r>
-          </w:p>
-        </w:tc>
-        <w:tc>
-          <w:tcPr>
-            <w:tcW w:type="dxa" w:w="2494"/>
-            <w:tcMar>
-              <w:top w:w="120" w:type="dxa"/>
-              <w:start w:w="130" w:type="dxa"/>
-              <w:bottom w:w="120" w:type="dxa"/>
-              <w:end w:w="130" w:type="dxa"/>
-            </w:tcMar>
-            <w:shd w:fill="EEF1FA"/>
-            <w:vAlign w:val="center"/>
-            <w:tcBorders>
-              <w:right w:val="single" w:sz="5" w:color="D9DDE7"/>
-            </w:tcBorders>
-          </w:tcPr>
-          <w:p>
-            <w:pPr>
-              <w:keepLines/>
-              <w:spacing w:before="0" w:after="60" w:line="240" w:lineRule="auto"/>
-            </w:pPr>
-            <w:r>
-              <w:rPr>
-                <w:rFonts w:ascii="Malgun Gothic" w:hAnsi="Malgun Gothic" w:eastAsia="Malgun Gothic"/>
-                <w:b/>
-                <w:color w:val="3264F5"/>
-                <w:sz w:val="17"/>
-              </w:rPr>
-              <w:t>사업 문서</w:t>
-            </w:r>
-          </w:p>
-          <w:p>
-            <w:pPr>
-              <w:keepLines/>
-              <w:spacing w:before="0" w:after="0" w:line="281" w:lineRule="auto"/>
-            </w:pPr>
-            <w:r>
-              <w:rPr>
-                <w:rFonts w:ascii="Malgun Gothic" w:hAnsi="Malgun Gothic" w:eastAsia="Malgun Gothic"/>
-                <w:b w:val="0"/>
-                <w:color w:val="111318"/>
-                <w:sz w:val="15"/>
-              </w:rPr>
-              <w:t>시장 조사·사업계획서·제안서 작성</w:t>
-            </w:r>
-          </w:p>
-        </w:tc>
-        <w:tc>
-          <w:tcPr>
-            <w:tcW w:type="dxa" w:w="2494"/>
-            <w:tcMar>
-              <w:top w:w="120" w:type="dxa"/>
-              <w:start w:w="130" w:type="dxa"/>
-              <w:bottom w:w="120" w:type="dxa"/>
-              <w:end w:w="130" w:type="dxa"/>
-            </w:tcMar>
-            <w:shd w:fill="EEF1FA"/>
-            <w:vAlign w:val="center"/>
-            <w:tcBorders>
-              <w:right w:val="single" w:sz="5" w:color="D9DDE7"/>
-            </w:tcBorders>
-          </w:tcPr>
-          <w:p>
-            <w:pPr>
-              <w:keepLines/>
-              <w:spacing w:before="0" w:after="60" w:line="240" w:lineRule="auto"/>
-            </w:pPr>
-            <w:r>
-              <w:rPr>
-                <w:rFonts w:ascii="Malgun Gothic" w:hAnsi="Malgun Gothic" w:eastAsia="Malgun Gothic"/>
-                <w:b/>
-                <w:color w:val="3264F5"/>
-                <w:sz w:val="17"/>
-              </w:rPr>
-              <w:t>발표 자료</w:t>
-            </w:r>
-          </w:p>
-          <w:p>
-            <w:pPr>
-              <w:keepLines/>
-              <w:spacing w:before="0" w:after="0" w:line="281" w:lineRule="auto"/>
-            </w:pPr>
-            <w:r>
-              <w:rPr>
-                <w:rFonts w:ascii="Malgun Gothic" w:hAnsi="Malgun Gothic" w:eastAsia="Malgun Gothic"/>
-                <w:b w:val="0"/>
-                <w:color w:val="111318"/>
-                <w:sz w:val="15"/>
-              </w:rPr>
-              <w:t>제안 논리·카피·PPT 정보 구조</w:t>
-            </w:r>
-          </w:p>
-        </w:tc>
-        <w:tc>
-          <w:tcPr>
-            <w:tcW w:type="dxa" w:w="2494"/>
-            <w:tcMar>
-              <w:top w:w="120" w:type="dxa"/>
-              <w:start w:w="130" w:type="dxa"/>
-              <w:bottom w:w="120" w:type="dxa"/>
-              <w:end w:w="130" w:type="dxa"/>
-            </w:tcMar>
-            <w:shd w:fill="EEF1FA"/>
-            <w:vAlign w:val="center"/>
-          </w:tcPr>
-          <w:p>
-            <w:pPr>
-              <w:keepLines/>
-              <w:spacing w:before="0" w:after="60" w:line="240" w:lineRule="auto"/>
-            </w:pPr>
-            <w:r>
-              <w:rPr>
-                <w:rFonts w:ascii="Malgun Gothic" w:hAnsi="Malgun Gothic" w:eastAsia="Malgun Gothic"/>
-                <w:b/>
-                <w:color w:val="3264F5"/>
-                <w:sz w:val="17"/>
-              </w:rPr>
-              <w:t>전시 협업</w:t>
-            </w:r>
-          </w:p>
-          <w:p>
-            <w:pPr>
-              <w:keepLines/>
-              <w:spacing w:before="0" w:after="0" w:line="281" w:lineRule="auto"/>
-            </w:pPr>
-            <w:r>
-              <w:rPr>
-                <w:rFonts w:ascii="Malgun Gothic" w:hAnsi="Malgun Gothic" w:eastAsia="Malgun Gothic"/>
-                <w:b w:val="0"/>
-                <w:color w:val="111318"/>
-                <w:sz w:val="15"/>
-              </w:rPr>
-              <w:t>부스·현장 콘텐츠·외부 제작 조율</w:t>
-            </w:r>
-          </w:p>
-        </w:tc>
-      </w:tr>
-    </w:tbl>
     <w:p>
+      <w:pPr>
+        <w:pStyle w:val="ListBullet"/>
+        <w:keepLines/>
+      </w:pPr>
+      <w:r>
+        <w:rPr>
+          <w:rFonts w:ascii="Malgun Gothic" w:hAnsi="Malgun Gothic" w:eastAsia="Malgun Gothic"/>
+          <w:color w:val="13161C"/>
+          <w:sz w:val="20"/>
+        </w:rPr>
+        <w:t>네이버 블로그·YouTube·Instagram·LinkedIn 콘텐츠 기획·제작·발행</w:t>
+      </w:r>
+    </w:p>
+    <w:p>
+      <w:pPr>
+        <w:pStyle w:val="ListBullet"/>
+        <w:keepLines/>
+      </w:pPr>
+      <w:r>
+        <w:rPr>
+          <w:rFonts w:ascii="Malgun Gothic" w:hAnsi="Malgun Gothic" w:eastAsia="Malgun Gothic"/>
+          <w:color w:val="13161C"/>
+          <w:sz w:val="20"/>
+        </w:rPr>
+        <w:t>AI 초안 생성, 검수 스킬, 직접 수정, 주간 검색 순위 확인으로 이어지는 블로그 운영 워크플로 구축</w:t>
+      </w:r>
+    </w:p>
+    <w:p>
+      <w:pPr>
+        <w:pStyle w:val="ListBullet"/>
+        <w:keepLines/>
+      </w:pPr>
+      <w:r>
+        <w:rPr>
+          <w:rFonts w:ascii="Malgun Gothic" w:hAnsi="Malgun Gothic" w:eastAsia="Malgun Gothic"/>
+          <w:color w:val="13161C"/>
+          <w:sz w:val="20"/>
+        </w:rPr>
+        <w:t>2026.07.31 기준 추적 키워드 10개 모두 검색 노출, 9개 5위 이내, 5개 1위 확인</w:t>
+      </w:r>
+    </w:p>
+    <w:p>
+      <w:pPr>
+        <w:pStyle w:val="ListBullet"/>
+        <w:keepLines/>
+      </w:pPr>
+      <w:r>
+        <w:rPr>
+          <w:rFonts w:ascii="Malgun Gothic" w:hAnsi="Malgun Gothic" w:eastAsia="Malgun Gothic"/>
+          <w:color w:val="13161C"/>
+          <w:sz w:val="20"/>
+        </w:rPr>
+        <w:t>시장·경쟁사 조사와 수출바우처 사업계획서 구조 설계·작성 및 3차 개정</w:t>
+      </w:r>
+    </w:p>
+    <w:p>
+      <w:pPr>
+        <w:pStyle w:val="ListBullet"/>
+        <w:keepLines/>
+      </w:pPr>
+      <w:r>
+        <w:rPr>
+          <w:rFonts w:ascii="Malgun Gothic" w:hAnsi="Malgun Gothic" w:eastAsia="Malgun Gothic"/>
+          <w:color w:val="13161C"/>
+          <w:sz w:val="20"/>
+        </w:rPr>
+        <w:t>HP 공동 웨비나 발표자료와 KOREA MAT 전시 콘텐츠·영상·현장 실행 담당</w:t>
+      </w:r>
+    </w:p>
+    <w:p>
+      <w:pPr>
+        <w:keepNext/>
+        <w:tabs>
+          <w:tab w:pos="9694" w:val="right"/>
+        </w:tabs>
+        <w:spacing w:before="280" w:after="120"/>
+      </w:pPr>
+      <w:r>
+        <w:rPr>
+          <w:rFonts w:ascii="Malgun Gothic" w:hAnsi="Malgun Gothic" w:eastAsia="Malgun Gothic"/>
+          <w:b/>
+          <w:color w:val="13161C"/>
+          <w:sz w:val="22"/>
+        </w:rPr>
+        <w:t>주식회사 푸딩 | 그래픽팀</w:t>
+      </w:r>
+      <w:r>
+        <w:rPr>
+          <w:rFonts w:ascii="Malgun Gothic" w:hAnsi="Malgun Gothic" w:eastAsia="Malgun Gothic"/>
+          <w:b/>
+          <w:color w:val="646872"/>
+          <w:sz w:val="19"/>
+        </w:rPr>
+        <w:tab/>
+        <w:t>2022.11–2023.11</w:t>
+      </w:r>
+    </w:p>
+    <w:p>
+      <w:pPr>
+        <w:pStyle w:val="ListBullet"/>
+        <w:keepLines/>
+      </w:pPr>
+      <w:r>
+        <w:rPr>
+          <w:rFonts w:ascii="Malgun Gothic" w:hAnsi="Malgun Gothic" w:eastAsia="Malgun Gothic"/>
+          <w:color w:val="13161C"/>
+          <w:sz w:val="20"/>
+        </w:rPr>
+        <w:t>웹페이지와 그래픽 결과물을 제작하며 콘텐츠의 시각 구조와 디자인 실무 경험 축적</w:t>
+      </w:r>
+    </w:p>
+    <w:p>
+      <w:pPr>
+        <w:keepNext/>
+        <w:tabs>
+          <w:tab w:pos="9694" w:val="right"/>
+        </w:tabs>
+        <w:spacing w:before="280" w:after="120"/>
+      </w:pPr>
+      <w:r>
+        <w:rPr>
+          <w:rFonts w:ascii="Malgun Gothic" w:hAnsi="Malgun Gothic" w:eastAsia="Malgun Gothic"/>
+          <w:b/>
+          <w:color w:val="13161C"/>
+          <w:sz w:val="22"/>
+        </w:rPr>
+        <w:t>대구사이버대학교 | 기획정보팀</w:t>
+      </w:r>
+      <w:r>
+        <w:rPr>
+          <w:rFonts w:ascii="Malgun Gothic" w:hAnsi="Malgun Gothic" w:eastAsia="Malgun Gothic"/>
+          <w:b/>
+          <w:color w:val="646872"/>
+          <w:sz w:val="19"/>
+        </w:rPr>
+        <w:tab/>
+        <w:t>2021.04–2022.04</w:t>
+      </w:r>
+    </w:p>
+    <w:p>
+      <w:pPr>
+        <w:pStyle w:val="ListBullet"/>
+        <w:keepLines/>
+      </w:pPr>
+      <w:r>
+        <w:rPr>
+          <w:rFonts w:ascii="Malgun Gothic" w:hAnsi="Malgun Gothic" w:eastAsia="Malgun Gothic"/>
+          <w:color w:val="13161C"/>
+          <w:sz w:val="20"/>
+        </w:rPr>
+        <w:t>웹디자인과 교내 디자인 실무를 담당하며 정보를 화면과 시각물로 구성</w:t>
+      </w:r>
+    </w:p>
+    <w:p>
+      <w:pPr>
+        <w:keepNext/>
+        <w:tabs>
+          <w:tab w:pos="9694" w:val="right"/>
+        </w:tabs>
+        <w:spacing w:before="280" w:after="120"/>
+      </w:pPr>
+      <w:r>
+        <w:rPr>
+          <w:rFonts w:ascii="Malgun Gothic" w:hAnsi="Malgun Gothic" w:eastAsia="Malgun Gothic"/>
+          <w:b/>
+          <w:color w:val="13161C"/>
+          <w:sz w:val="22"/>
+        </w:rPr>
+        <w:t>투썸플레이스 대구 영남대점 | 매장 운영</w:t>
+      </w:r>
+      <w:r>
+        <w:rPr>
+          <w:rFonts w:ascii="Malgun Gothic" w:hAnsi="Malgun Gothic" w:eastAsia="Malgun Gothic"/>
+          <w:b/>
+          <w:color w:val="646872"/>
+          <w:sz w:val="19"/>
+        </w:rPr>
+        <w:tab/>
+        <w:t>2014.05–2019.10</w:t>
+      </w:r>
+    </w:p>
+    <w:p>
+      <w:pPr>
+        <w:pStyle w:val="ListBullet"/>
+        <w:keepLines/>
+      </w:pPr>
+      <w:r>
+        <w:rPr>
+          <w:rFonts w:ascii="Malgun Gothic" w:hAnsi="Malgun Gothic" w:eastAsia="Malgun Gothic"/>
+          <w:color w:val="13161C"/>
+          <w:sz w:val="20"/>
+        </w:rPr>
+        <w:t>고객 응대와 매장 운영을 통해 이용자 관점과 현장 운영 경험 축적</w:t>
+      </w:r>
+    </w:p>
+    <w:p>
+      <w:pPr>
+        <w:spacing w:after="0"/>
+      </w:pPr>
       <w:r>
         <w:br w:type="page"/>
       </w:r>
     </w:p>
     <w:p>
       <w:pPr>
-        <w:keepLines w:val="0"/>
-        <w:spacing w:before="0" w:after="20" w:line="240" w:lineRule="auto"/>
-        <w:jc w:val="left"/>
+        <w:pStyle w:val="Heading1"/>
+        <w:pageBreakBefore w:val="0"/>
       </w:pPr>
       <w:r>
         <w:rPr>
-          <w:rFonts w:ascii="Arial" w:hAnsi="Arial" w:eastAsia="Arial"/>
+          <w:rFonts w:ascii="Malgun Gothic" w:hAnsi="Malgun Gothic" w:eastAsia="Malgun Gothic"/>
           <w:b/>
-          <w:i w:val="0"/>
           <w:color w:val="3264F5"/>
-          <w:sz w:val="16"/>
+          <w:sz w:val="25"/>
         </w:rPr>
         <w:t>SELECTED PROJECTS</w:t>
       </w:r>
     </w:p>
     <w:p>
       <w:pPr>
-        <w:keepLines w:val="0"/>
-        <w:spacing w:before="0" w:after="160" w:line="252" w:lineRule="auto"/>
-        <w:jc w:val="left"/>
+        <w:spacing w:after="80"/>
+      </w:pPr>
+      <w:r>
+        <w:rPr>
+          <w:rFonts w:ascii="Malgun Gothic" w:hAnsi="Malgun Gothic" w:eastAsia="Malgun Gothic"/>
+          <w:color w:val="646872"/>
+          <w:sz w:val="20"/>
+        </w:rPr>
+        <w:t>결과물뿐 아니라 제작 과정과 운영 방식까지 연결한 대표 사례입니다.</w:t>
+      </w:r>
+    </w:p>
+    <w:p>
+      <w:pPr>
+        <w:keepNext/>
+        <w:spacing w:before="400" w:after="140"/>
       </w:pPr>
       <w:r>
         <w:rPr>
           <w:rFonts w:ascii="Malgun Gothic" w:hAnsi="Malgun Gothic" w:eastAsia="Malgun Gothic"/>
           <w:b/>
-          <w:i w:val="0"/>
-          <w:color w:val="111318"/>
-          <w:sz w:val="37"/>
+          <w:color w:val="3264F5"/>
+          <w:sz w:val="21"/>
         </w:rPr>
-        <w:t>결과물과 운영 방식으로 연결한 대표 프로젝트</w:t>
+        <w:t xml:space="preserve">01  </w:t>
+      </w:r>
+      <w:r>
+        <w:rPr>
+          <w:rFonts w:ascii="Malgun Gothic" w:hAnsi="Malgun Gothic" w:eastAsia="Malgun Gothic"/>
+          <w:b/>
+          <w:color w:val="13161C"/>
+          <w:sz w:val="23"/>
+        </w:rPr>
+        <w:t>콘텐츠 운영 자동화</w:t>
       </w:r>
     </w:p>
-    <w:tbl>
-      <w:tblPr>
-        <w:tblW w:type="auto" w:w="0"/>
-        <w:jc w:val="center"/>
-        <w:tblLayout w:type="fixed"/>
-        <w:tblLook w:firstColumn="1" w:firstRow="1" w:lastColumn="0" w:lastRow="0" w:noHBand="0" w:noVBand="1" w:val="04A0"/>
-        <w:tblBorders>
-          <w:top w:val="nil"/>
-          <w:left w:val="nil"/>
-          <w:bottom w:val="nil"/>
-          <w:right w:val="nil"/>
-          <w:insideH w:val="nil"/>
-          <w:insideV w:val="nil"/>
-        </w:tblBorders>
-      </w:tblPr>
-      <w:tblGrid>
-        <w:gridCol w:w="4989"/>
-        <w:gridCol w:w="4989"/>
-      </w:tblGrid>
-      <w:tr>
-        <w:tc>
-          <w:tcPr>
-            <w:tcW w:type="dxa" w:w="4988"/>
-            <w:tcMar>
-              <w:top w:w="170" w:type="dxa"/>
-              <w:start w:w="170" w:type="dxa"/>
-              <w:bottom w:w="170" w:type="dxa"/>
-              <w:end w:w="170" w:type="dxa"/>
-            </w:tcMar>
-            <w:vAlign w:val="top"/>
-            <w:tcBorders>
-              <w:right w:val="single" w:sz="5" w:color="D9DDE7"/>
-              <w:bottom w:val="single" w:sz="5" w:color="D9DDE7"/>
-            </w:tcBorders>
-          </w:tcPr>
-          <w:p>
-            <w:pPr>
-              <w:keepLines w:val="0"/>
-              <w:spacing w:before="0" w:after="60" w:line="240" w:lineRule="auto"/>
-              <w:jc w:val="left"/>
-            </w:pPr>
-            <w:r>
-              <w:rPr>
-                <w:rFonts w:ascii="Arial" w:hAnsi="Arial" w:eastAsia="Arial"/>
-                <w:b/>
-                <w:i w:val="0"/>
-                <w:color w:val="3264F5"/>
-                <w:sz w:val="16"/>
-              </w:rPr>
-              <w:t>01</w:t>
-            </w:r>
-          </w:p>
-          <w:p>
-            <w:pPr>
-              <w:keepLines w:val="0"/>
-              <w:spacing w:before="0" w:after="80" w:line="264" w:lineRule="auto"/>
-              <w:jc w:val="left"/>
-            </w:pPr>
-            <w:r>
-              <w:rPr>
-                <w:rFonts w:ascii="Malgun Gothic" w:hAnsi="Malgun Gothic" w:eastAsia="Malgun Gothic"/>
-                <w:b/>
-                <w:i w:val="0"/>
-                <w:color w:val="111318"/>
-                <w:sz w:val="22"/>
-              </w:rPr>
-              <w:t>콘텐츠 운영 자동화</w:t>
-            </w:r>
-          </w:p>
-          <w:p>
-            <w:pPr>
-              <w:keepLines w:val="0"/>
-              <w:spacing w:before="0" w:after="100" w:line="288" w:lineRule="auto"/>
-              <w:jc w:val="left"/>
-            </w:pPr>
-            <w:r>
-              <w:rPr>
-                <w:rFonts w:ascii="Malgun Gothic" w:hAnsi="Malgun Gothic" w:eastAsia="Malgun Gothic"/>
-                <w:b w:val="0"/>
-                <w:i w:val="0"/>
-                <w:color w:val="111318"/>
-                <w:sz w:val="17"/>
-              </w:rPr>
-              <w:t>블로그 초안 생성, 1차 검수 스킬, 직접 수정과 2차 검수, 발행과 SEO 피드백을 하나의 반복 흐름으로 구성했습니다.</w:t>
-            </w:r>
-          </w:p>
-          <w:p>
-            <w:pPr>
-              <w:keepLines w:val="0"/>
-              <w:spacing w:before="0" w:after="0" w:line="278" w:lineRule="auto"/>
-              <w:jc w:val="left"/>
-            </w:pPr>
-            <w:r>
-              <w:rPr>
-                <w:rFonts w:ascii="Malgun Gothic" w:hAnsi="Malgun Gothic" w:eastAsia="Malgun Gothic"/>
-                <w:b/>
-                <w:i w:val="0"/>
-                <w:color w:val="3264F5"/>
-                <w:sz w:val="16"/>
-              </w:rPr>
-              <w:t>추적 키워드 10개 모두 검색 노출 · 9개 5위 이내 · 5개 1위</w:t>
-            </w:r>
-          </w:p>
-        </w:tc>
-        <w:tc>
-          <w:tcPr>
-            <w:tcW w:type="dxa" w:w="4988"/>
-            <w:tcMar>
-              <w:top w:w="170" w:type="dxa"/>
-              <w:start w:w="170" w:type="dxa"/>
-              <w:bottom w:w="170" w:type="dxa"/>
-              <w:end w:w="170" w:type="dxa"/>
-            </w:tcMar>
-            <w:vAlign w:val="top"/>
-            <w:tcBorders>
-              <w:bottom w:val="single" w:sz="5" w:color="D9DDE7"/>
-            </w:tcBorders>
-          </w:tcPr>
-          <w:p>
-            <w:pPr>
-              <w:keepLines w:val="0"/>
-              <w:spacing w:before="0" w:after="60" w:line="240" w:lineRule="auto"/>
-              <w:jc w:val="left"/>
-            </w:pPr>
-            <w:r>
-              <w:rPr>
-                <w:rFonts w:ascii="Arial" w:hAnsi="Arial" w:eastAsia="Arial"/>
-                <w:b/>
-                <w:i w:val="0"/>
-                <w:color w:val="3264F5"/>
-                <w:sz w:val="16"/>
-              </w:rPr>
-              <w:t>02</w:t>
-            </w:r>
-          </w:p>
-          <w:p>
-            <w:pPr>
-              <w:keepLines w:val="0"/>
-              <w:spacing w:before="0" w:after="80" w:line="264" w:lineRule="auto"/>
-              <w:jc w:val="left"/>
-            </w:pPr>
-            <w:r>
-              <w:rPr>
-                <w:rFonts w:ascii="Malgun Gothic" w:hAnsi="Malgun Gothic" w:eastAsia="Malgun Gothic"/>
-                <w:b/>
-                <w:i w:val="0"/>
-                <w:color w:val="111318"/>
-                <w:sz w:val="22"/>
-              </w:rPr>
-              <w:t>수출바우처 사업계획서</w:t>
-            </w:r>
-          </w:p>
-          <w:p>
-            <w:pPr>
-              <w:keepLines w:val="0"/>
-              <w:spacing w:before="0" w:after="100" w:line="288" w:lineRule="auto"/>
-              <w:jc w:val="left"/>
-            </w:pPr>
-            <w:r>
-              <w:rPr>
-                <w:rFonts w:ascii="Malgun Gothic" w:hAnsi="Malgun Gothic" w:eastAsia="Malgun Gothic"/>
-                <w:b w:val="0"/>
-                <w:i w:val="0"/>
-                <w:color w:val="111318"/>
-                <w:sz w:val="17"/>
-              </w:rPr>
-              <w:t>AI로 조사 자료를 정리하고 시장 환경, 회사 역량, 수출 목표와 실행 계획이 이어지도록 구조를 직접 설계해 세 차례 개정했습니다.</w:t>
-            </w:r>
-          </w:p>
-          <w:p>
-            <w:pPr>
-              <w:keepLines w:val="0"/>
-              <w:spacing w:before="0" w:after="0" w:line="278" w:lineRule="auto"/>
-              <w:jc w:val="left"/>
-            </w:pPr>
-            <w:r>
-              <w:rPr>
-                <w:rFonts w:ascii="Malgun Gothic" w:hAnsi="Malgun Gothic" w:eastAsia="Malgun Gothic"/>
-                <w:b/>
-                <w:i w:val="0"/>
-                <w:color w:val="3264F5"/>
-                <w:sz w:val="16"/>
-              </w:rPr>
-              <w:t>2026년 1차 수출바우처 사업 선정 · 총 4,500만 원 규모</w:t>
-            </w:r>
-          </w:p>
-        </w:tc>
-      </w:tr>
-      <w:tr>
-        <w:tc>
-          <w:tcPr>
-            <w:tcW w:type="dxa" w:w="4988"/>
-            <w:tcMar>
-              <w:top w:w="170" w:type="dxa"/>
-              <w:start w:w="170" w:type="dxa"/>
-              <w:bottom w:w="170" w:type="dxa"/>
-              <w:end w:w="170" w:type="dxa"/>
-            </w:tcMar>
-            <w:vAlign w:val="top"/>
-            <w:tcBorders>
-              <w:right w:val="single" w:sz="5" w:color="D9DDE7"/>
-            </w:tcBorders>
-          </w:tcPr>
-          <w:p>
-            <w:pPr>
-              <w:keepLines w:val="0"/>
-              <w:spacing w:before="0" w:after="60" w:line="240" w:lineRule="auto"/>
-              <w:jc w:val="left"/>
-            </w:pPr>
-            <w:r>
-              <w:rPr>
-                <w:rFonts w:ascii="Arial" w:hAnsi="Arial" w:eastAsia="Arial"/>
-                <w:b/>
-                <w:i w:val="0"/>
-                <w:color w:val="3264F5"/>
-                <w:sz w:val="16"/>
-              </w:rPr>
-              <w:t>03</w:t>
-            </w:r>
-          </w:p>
-          <w:p>
-            <w:pPr>
-              <w:keepLines w:val="0"/>
-              <w:spacing w:before="0" w:after="80" w:line="264" w:lineRule="auto"/>
-              <w:jc w:val="left"/>
-            </w:pPr>
-            <w:r>
-              <w:rPr>
-                <w:rFonts w:ascii="Malgun Gothic" w:hAnsi="Malgun Gothic" w:eastAsia="Malgun Gothic"/>
-                <w:b/>
-                <w:i w:val="0"/>
-                <w:color w:val="111318"/>
-                <w:sz w:val="22"/>
-              </w:rPr>
-              <w:t>HP 공동 웨비나</w:t>
-            </w:r>
-          </w:p>
-          <w:p>
-            <w:pPr>
-              <w:keepLines w:val="0"/>
-              <w:spacing w:before="0" w:after="100" w:line="288" w:lineRule="auto"/>
-              <w:jc w:val="left"/>
-            </w:pPr>
-            <w:r>
-              <w:rPr>
-                <w:rFonts w:ascii="Malgun Gothic" w:hAnsi="Malgun Gothic" w:eastAsia="Malgun Gothic"/>
-                <w:b w:val="0"/>
-                <w:i w:val="0"/>
-                <w:color w:val="111318"/>
-                <w:sz w:val="17"/>
-              </w:rPr>
-              <w:t>회사 YouTube 기술 콘텐츠를 바탕으로 제조 현장의 문제와 3D 프린팅 적용 사례가 이어지도록 더프라임그룹 발표 섹션을 구성·디자인했습니다.</w:t>
-            </w:r>
-          </w:p>
-          <w:p>
-            <w:pPr>
-              <w:keepLines w:val="0"/>
-              <w:spacing w:before="0" w:after="0" w:line="278" w:lineRule="auto"/>
-              <w:jc w:val="left"/>
-            </w:pPr>
-            <w:r>
-              <w:rPr>
-                <w:rFonts w:ascii="Malgun Gothic" w:hAnsi="Malgun Gothic" w:eastAsia="Malgun Gothic"/>
-                <w:b/>
-                <w:i w:val="0"/>
-                <w:color w:val="3264F5"/>
-                <w:sz w:val="16"/>
-              </w:rPr>
-              <w:t>230명 등록 · 약 170명 실시간 참석 · 후속 신청 37건</w:t>
-            </w:r>
-          </w:p>
-        </w:tc>
-        <w:tc>
-          <w:tcPr>
-            <w:tcW w:type="dxa" w:w="4988"/>
-            <w:tcMar>
-              <w:top w:w="170" w:type="dxa"/>
-              <w:start w:w="170" w:type="dxa"/>
-              <w:bottom w:w="170" w:type="dxa"/>
-              <w:end w:w="170" w:type="dxa"/>
-            </w:tcMar>
-            <w:vAlign w:val="top"/>
-          </w:tcPr>
-          <w:p>
-            <w:pPr>
-              <w:keepLines w:val="0"/>
-              <w:spacing w:before="0" w:after="60" w:line="240" w:lineRule="auto"/>
-              <w:jc w:val="left"/>
-            </w:pPr>
-            <w:r>
-              <w:rPr>
-                <w:rFonts w:ascii="Arial" w:hAnsi="Arial" w:eastAsia="Arial"/>
-                <w:b/>
-                <w:i w:val="0"/>
-                <w:color w:val="3264F5"/>
-                <w:sz w:val="16"/>
-              </w:rPr>
-              <w:t>04</w:t>
-            </w:r>
-          </w:p>
-          <w:p>
-            <w:pPr>
-              <w:keepLines w:val="0"/>
-              <w:spacing w:before="0" w:after="80" w:line="264" w:lineRule="auto"/>
-              <w:jc w:val="left"/>
-            </w:pPr>
-            <w:r>
-              <w:rPr>
-                <w:rFonts w:ascii="Malgun Gothic" w:hAnsi="Malgun Gothic" w:eastAsia="Malgun Gothic"/>
-                <w:b/>
-                <w:i w:val="0"/>
-                <w:color w:val="111318"/>
-                <w:sz w:val="22"/>
-              </w:rPr>
-              <w:t>KOREA MAT 전시</w:t>
-            </w:r>
-          </w:p>
-          <w:p>
-            <w:pPr>
-              <w:keepLines w:val="0"/>
-              <w:spacing w:before="0" w:after="100" w:line="288" w:lineRule="auto"/>
-              <w:jc w:val="left"/>
-            </w:pPr>
-            <w:r>
-              <w:rPr>
-                <w:rFonts w:ascii="Malgun Gothic" w:hAnsi="Malgun Gothic" w:eastAsia="Malgun Gothic"/>
-                <w:b w:val="0"/>
-                <w:i w:val="0"/>
-                <w:color w:val="111318"/>
-                <w:sz w:val="17"/>
-              </w:rPr>
-              <w:t>AMR 시연과 상담이 이어지도록 부스 공간과 상영 영상, 현장 콘텐츠를 기획하고 외부 제작 일정과 구현 결과를 확인했습니다.</w:t>
-            </w:r>
-          </w:p>
-          <w:p>
-            <w:pPr>
-              <w:keepLines w:val="0"/>
-              <w:spacing w:before="0" w:after="0" w:line="278" w:lineRule="auto"/>
-              <w:jc w:val="left"/>
-            </w:pPr>
-            <w:r>
-              <w:rPr>
-                <w:rFonts w:ascii="Malgun Gothic" w:hAnsi="Malgun Gothic" w:eastAsia="Malgun Gothic"/>
-                <w:b/>
-                <w:i w:val="0"/>
-                <w:color w:val="3264F5"/>
-                <w:sz w:val="16"/>
-              </w:rPr>
-              <w:t>부스 구성과 직접 촬영·편집한 상영 영상 현장 구현</w:t>
-            </w:r>
-          </w:p>
-        </w:tc>
-      </w:tr>
-    </w:tbl>
     <w:p>
       <w:pPr>
+        <w:pStyle w:val="ListBullet"/>
         <w:keepLines/>
-        <w:spacing w:before="160" w:after="100" w:line="240" w:lineRule="auto"/>
-        <w:jc w:val="left"/>
-        <w:pBdr>
-          <w:bottom w:val="single" w:sz="10" w:space="4" w:color="3264F5"/>
-        </w:pBdr>
-      </w:pPr>
-      <w:r>
-        <w:rPr>
-          <w:rFonts w:ascii="Arial" w:hAnsi="Arial" w:eastAsia="Arial"/>
-          <w:b/>
-          <w:i w:val="0"/>
-          <w:color w:val="3264F5"/>
-          <w:sz w:val="16"/>
-        </w:rPr>
-        <w:t>HOW I WORK</w:t>
-      </w:r>
-    </w:p>
-    <w:tbl>
-      <w:tblPr>
-        <w:tblW w:type="auto" w:w="0"/>
-        <w:jc w:val="center"/>
-        <w:tblLayout w:type="fixed"/>
-        <w:tblLook w:firstColumn="1" w:firstRow="1" w:lastColumn="0" w:lastRow="0" w:noHBand="0" w:noVBand="1" w:val="04A0"/>
-        <w:tblBorders>
-          <w:top w:val="nil"/>
-          <w:left w:val="nil"/>
-          <w:bottom w:val="nil"/>
-          <w:right w:val="nil"/>
-          <w:insideH w:val="nil"/>
-          <w:insideV w:val="nil"/>
-        </w:tblBorders>
-      </w:tblPr>
-      <w:tblGrid>
-        <w:gridCol w:w="3326"/>
-        <w:gridCol w:w="3326"/>
-        <w:gridCol w:w="3326"/>
-      </w:tblGrid>
-      <w:tr>
-        <w:tc>
-          <w:tcPr>
-            <w:tcW w:type="dxa" w:w="3327"/>
-            <w:tcMar>
-              <w:top w:w="90" w:type="dxa"/>
-              <w:start w:w="120" w:type="dxa"/>
-              <w:bottom w:w="90" w:type="dxa"/>
-              <w:end w:w="120" w:type="dxa"/>
-            </w:tcMar>
-            <w:tcBorders>
-              <w:right w:val="single" w:sz="5" w:color="D9DDE7"/>
-            </w:tcBorders>
-          </w:tcPr>
-          <w:p>
-            <w:pPr>
-              <w:keepLines w:val="0"/>
-              <w:spacing w:before="0" w:after="60" w:line="240" w:lineRule="auto"/>
-              <w:jc w:val="left"/>
-            </w:pPr>
-            <w:r>
-              <w:rPr>
-                <w:rFonts w:ascii="Malgun Gothic" w:hAnsi="Malgun Gothic" w:eastAsia="Malgun Gothic"/>
-                <w:b/>
-                <w:i w:val="0"/>
-                <w:color w:val="3264F5"/>
-                <w:sz w:val="17"/>
-              </w:rPr>
-              <w:t>01  정리</w:t>
-            </w:r>
-          </w:p>
-          <w:p>
-            <w:pPr>
-              <w:keepLines w:val="0"/>
-              <w:spacing w:before="0" w:after="0" w:line="283" w:lineRule="auto"/>
-              <w:jc w:val="left"/>
-            </w:pPr>
-            <w:r>
-              <w:rPr>
-                <w:rFonts w:ascii="Malgun Gothic" w:hAnsi="Malgun Gothic" w:eastAsia="Malgun Gothic"/>
-                <w:b w:val="0"/>
-                <w:i w:val="0"/>
-                <w:color w:val="111318"/>
-                <w:sz w:val="17"/>
-              </w:rPr>
-              <w:t>자료와 목적을 확인하고 독자에게 필요한 정보와 순서를 정합니다.</w:t>
-            </w:r>
-          </w:p>
-        </w:tc>
-        <w:tc>
-          <w:tcPr>
-            <w:tcW w:type="dxa" w:w="3327"/>
-            <w:tcMar>
-              <w:top w:w="90" w:type="dxa"/>
-              <w:start w:w="120" w:type="dxa"/>
-              <w:bottom w:w="90" w:type="dxa"/>
-              <w:end w:w="120" w:type="dxa"/>
-            </w:tcMar>
-            <w:tcBorders>
-              <w:right w:val="single" w:sz="5" w:color="D9DDE7"/>
-            </w:tcBorders>
-          </w:tcPr>
-          <w:p>
-            <w:pPr>
-              <w:keepLines w:val="0"/>
-              <w:spacing w:before="0" w:after="60" w:line="240" w:lineRule="auto"/>
-              <w:jc w:val="left"/>
-            </w:pPr>
-            <w:r>
-              <w:rPr>
-                <w:rFonts w:ascii="Malgun Gothic" w:hAnsi="Malgun Gothic" w:eastAsia="Malgun Gothic"/>
-                <w:b/>
-                <w:i w:val="0"/>
-                <w:color w:val="3264F5"/>
-                <w:sz w:val="17"/>
-              </w:rPr>
-              <w:t>02  제작</w:t>
-            </w:r>
-          </w:p>
-          <w:p>
-            <w:pPr>
-              <w:keepLines w:val="0"/>
-              <w:spacing w:before="0" w:after="0" w:line="283" w:lineRule="auto"/>
-              <w:jc w:val="left"/>
-            </w:pPr>
-            <w:r>
-              <w:rPr>
-                <w:rFonts w:ascii="Malgun Gothic" w:hAnsi="Malgun Gothic" w:eastAsia="Malgun Gothic"/>
-                <w:b w:val="0"/>
-                <w:i w:val="0"/>
-                <w:color w:val="111318"/>
-                <w:sz w:val="17"/>
-              </w:rPr>
-              <w:t>콘텐츠, 사업 문서, 영상, 전시에 맞게 내용과 제작 단계를 구성합니다.</w:t>
-            </w:r>
-          </w:p>
-        </w:tc>
-        <w:tc>
-          <w:tcPr>
-            <w:tcW w:type="dxa" w:w="3322"/>
-            <w:tcMar>
-              <w:top w:w="90" w:type="dxa"/>
-              <w:start w:w="120" w:type="dxa"/>
-              <w:bottom w:w="90" w:type="dxa"/>
-              <w:end w:w="120" w:type="dxa"/>
-            </w:tcMar>
-          </w:tcPr>
-          <w:p>
-            <w:pPr>
-              <w:keepLines w:val="0"/>
-              <w:spacing w:before="0" w:after="60" w:line="240" w:lineRule="auto"/>
-              <w:jc w:val="left"/>
-            </w:pPr>
-            <w:r>
-              <w:rPr>
-                <w:rFonts w:ascii="Malgun Gothic" w:hAnsi="Malgun Gothic" w:eastAsia="Malgun Gothic"/>
-                <w:b/>
-                <w:i w:val="0"/>
-                <w:color w:val="3264F5"/>
-                <w:sz w:val="17"/>
-              </w:rPr>
-              <w:t>03  검수</w:t>
-            </w:r>
-          </w:p>
-          <w:p>
-            <w:pPr>
-              <w:keepLines w:val="0"/>
-              <w:spacing w:before="0" w:after="0" w:line="283" w:lineRule="auto"/>
-              <w:jc w:val="left"/>
-            </w:pPr>
-            <w:r>
-              <w:rPr>
-                <w:rFonts w:ascii="Malgun Gothic" w:hAnsi="Malgun Gothic" w:eastAsia="Malgun Gothic"/>
-                <w:b w:val="0"/>
-                <w:i w:val="0"/>
-                <w:color w:val="111318"/>
-                <w:sz w:val="17"/>
-              </w:rPr>
-              <w:t>AI 결과와 외부 제작물을 그대로 쓰지 않고 출처와 최종 내용을 확인합니다.</w:t>
-            </w:r>
-          </w:p>
-        </w:tc>
-      </w:tr>
-    </w:tbl>
-    <w:p>
-      <w:pPr>
-        <w:keepLines/>
-        <w:spacing w:before="160" w:after="80" w:line="240" w:lineRule="auto"/>
-        <w:jc w:val="left"/>
-        <w:pBdr>
-          <w:bottom w:val="single" w:sz="10" w:space="4" w:color="3264F5"/>
-        </w:pBdr>
-      </w:pPr>
-      <w:r>
-        <w:rPr>
-          <w:rFonts w:ascii="Arial" w:hAnsi="Arial" w:eastAsia="Arial"/>
-          <w:b/>
-          <w:i w:val="0"/>
-          <w:color w:val="3264F5"/>
-          <w:sz w:val="16"/>
-        </w:rPr>
-        <w:t>TRAINING &amp; TOOLS</w:t>
-      </w:r>
-    </w:p>
-    <w:tbl>
-      <w:tblPr>
-        <w:tblW w:type="auto" w:w="0"/>
-        <w:jc w:val="center"/>
-        <w:tblLayout w:type="fixed"/>
-        <w:tblLook w:firstColumn="1" w:firstRow="1" w:lastColumn="0" w:lastRow="0" w:noHBand="0" w:noVBand="1" w:val="04A0"/>
-        <w:tblBorders>
-          <w:top w:val="nil"/>
-          <w:left w:val="nil"/>
-          <w:bottom w:val="nil"/>
-          <w:right w:val="nil"/>
-          <w:insideH w:val="nil"/>
-          <w:insideV w:val="nil"/>
-        </w:tblBorders>
-      </w:tblPr>
-      <w:tblGrid>
-        <w:gridCol w:w="4989"/>
-        <w:gridCol w:w="4989"/>
-      </w:tblGrid>
-      <w:tr>
-        <w:tc>
-          <w:tcPr>
-            <w:tcW w:type="dxa" w:w="4988"/>
-            <w:tcMar>
-              <w:top w:w="70" w:type="dxa"/>
-              <w:start w:w="0" w:type="dxa"/>
-              <w:bottom w:w="70" w:type="dxa"/>
-              <w:end w:w="250" w:type="dxa"/>
-            </w:tcMar>
-            <w:tcBorders>
-              <w:right w:val="single" w:sz="5" w:color="D9DDE7"/>
-            </w:tcBorders>
-          </w:tcPr>
-          <w:p>
-            <w:pPr>
-              <w:keepLines w:val="0"/>
-              <w:spacing w:before="0" w:after="80" w:line="240" w:lineRule="auto"/>
-              <w:jc w:val="left"/>
-            </w:pPr>
-            <w:r>
-              <w:rPr>
-                <w:rFonts w:ascii="Arial" w:hAnsi="Arial" w:eastAsia="Arial"/>
-                <w:b/>
-                <w:i w:val="0"/>
-                <w:color w:val="3264F5"/>
-                <w:sz w:val="16"/>
-              </w:rPr>
-              <w:t>EDUCATION</w:t>
-            </w:r>
-          </w:p>
-          <w:p>
-            <w:pPr>
-              <w:keepLines w:val="0"/>
-              <w:spacing w:before="0" w:after="40" w:line="269" w:lineRule="auto"/>
-              <w:jc w:val="left"/>
-            </w:pPr>
-            <w:r>
-              <w:rPr>
-                <w:rFonts w:ascii="Malgun Gothic" w:hAnsi="Malgun Gothic" w:eastAsia="Malgun Gothic"/>
-                <w:b/>
-                <w:i w:val="0"/>
-                <w:color w:val="111318"/>
-                <w:sz w:val="16"/>
-              </w:rPr>
-              <w:t xml:space="preserve">2020.06–2020.12  </w:t>
-            </w:r>
-            <w:r>
-              <w:rPr>
-                <w:rFonts w:ascii="Malgun Gothic" w:hAnsi="Malgun Gothic" w:eastAsia="Malgun Gothic"/>
-                <w:b w:val="0"/>
-                <w:i w:val="0"/>
-                <w:color w:val="111318"/>
-                <w:sz w:val="16"/>
-              </w:rPr>
-              <w:t>SBS컴퓨터아카데미 · 스마트기기 UI/UX 웹디자인 양성과정</w:t>
-            </w:r>
-          </w:p>
-          <w:p>
-            <w:pPr>
-              <w:keepLines w:val="0"/>
-              <w:spacing w:before="0" w:after="0" w:line="269" w:lineRule="auto"/>
-              <w:jc w:val="left"/>
-            </w:pPr>
-            <w:r>
-              <w:rPr>
-                <w:rFonts w:ascii="Malgun Gothic" w:hAnsi="Malgun Gothic" w:eastAsia="Malgun Gothic"/>
-                <w:b/>
-                <w:i w:val="0"/>
-                <w:color w:val="111318"/>
-                <w:sz w:val="16"/>
-              </w:rPr>
-              <w:t xml:space="preserve">2008.03–2010.02  </w:t>
-            </w:r>
-            <w:r>
-              <w:rPr>
-                <w:rFonts w:ascii="Malgun Gothic" w:hAnsi="Malgun Gothic" w:eastAsia="Malgun Gothic"/>
-                <w:b w:val="0"/>
-                <w:i w:val="0"/>
-                <w:color w:val="111318"/>
-                <w:sz w:val="16"/>
-              </w:rPr>
-              <w:t>수성대학교 · 호텔조리과 졸업</w:t>
-            </w:r>
-          </w:p>
-        </w:tc>
-        <w:tc>
-          <w:tcPr>
-            <w:tcW w:type="dxa" w:w="4988"/>
-            <w:tcMar>
-              <w:top w:w="70" w:type="dxa"/>
-              <w:start w:w="250" w:type="dxa"/>
-              <w:bottom w:w="70" w:type="dxa"/>
-              <w:end w:w="0" w:type="dxa"/>
-            </w:tcMar>
-          </w:tcPr>
-          <w:p>
-            <w:pPr>
-              <w:keepLines w:val="0"/>
-              <w:spacing w:before="0" w:after="80" w:line="240" w:lineRule="auto"/>
-              <w:jc w:val="left"/>
-            </w:pPr>
-            <w:r>
-              <w:rPr>
-                <w:rFonts w:ascii="Arial" w:hAnsi="Arial" w:eastAsia="Arial"/>
-                <w:b/>
-                <w:i w:val="0"/>
-                <w:color w:val="3264F5"/>
-                <w:sz w:val="16"/>
-              </w:rPr>
-              <w:t>TOOLS</w:t>
-            </w:r>
-          </w:p>
-          <w:p>
-            <w:pPr>
-              <w:keepLines w:val="0"/>
-              <w:spacing w:before="0" w:after="60" w:line="276" w:lineRule="auto"/>
-              <w:jc w:val="left"/>
-            </w:pPr>
-            <w:r>
-              <w:rPr>
-                <w:rFonts w:ascii="Malgun Gothic" w:hAnsi="Malgun Gothic" w:eastAsia="Malgun Gothic"/>
-                <w:b/>
-                <w:i w:val="0"/>
-                <w:color w:val="111318"/>
-                <w:sz w:val="16"/>
-              </w:rPr>
-              <w:t xml:space="preserve">조사·초안·구조화  </w:t>
-            </w:r>
-            <w:r>
-              <w:rPr>
-                <w:rFonts w:ascii="Malgun Gothic" w:hAnsi="Malgun Gothic" w:eastAsia="Malgun Gothic"/>
-                <w:b w:val="0"/>
-                <w:i w:val="0"/>
-                <w:color w:val="111318"/>
-                <w:sz w:val="16"/>
-              </w:rPr>
-              <w:t>GPT, Perplexity, Gemini, NotebookLM, Claude Code, Codex</w:t>
-            </w:r>
-          </w:p>
-          <w:p>
-            <w:pPr>
-              <w:keepLines w:val="0"/>
-              <w:spacing w:before="0" w:after="0" w:line="276" w:lineRule="auto"/>
-              <w:jc w:val="left"/>
-            </w:pPr>
-            <w:r>
-              <w:rPr>
-                <w:rFonts w:ascii="Malgun Gothic" w:hAnsi="Malgun Gothic" w:eastAsia="Malgun Gothic"/>
-                <w:b/>
-                <w:i w:val="0"/>
-                <w:color w:val="111318"/>
-                <w:sz w:val="16"/>
-              </w:rPr>
-              <w:t xml:space="preserve">디자인·영상  </w:t>
-            </w:r>
-            <w:r>
-              <w:rPr>
-                <w:rFonts w:ascii="Malgun Gothic" w:hAnsi="Malgun Gothic" w:eastAsia="Malgun Gothic"/>
-                <w:b w:val="0"/>
-                <w:i w:val="0"/>
-                <w:color w:val="111318"/>
-                <w:sz w:val="16"/>
-              </w:rPr>
-              <w:t>Photoshop, Illustrator, Figma, Premiere Pro</w:t>
-            </w:r>
-          </w:p>
-        </w:tc>
-      </w:tr>
-    </w:tbl>
-    <w:p>
-      <w:pPr>
-        <w:keepLines w:val="0"/>
-        <w:spacing w:before="200" w:after="0" w:line="264" w:lineRule="auto"/>
-        <w:jc w:val="center"/>
       </w:pPr>
       <w:r>
         <w:rPr>
           <w:rFonts w:ascii="Malgun Gothic" w:hAnsi="Malgun Gothic" w:eastAsia="Malgun Gothic"/>
-          <w:b w:val="0"/>
-          <w:i w:val="0"/>
-          <w:color w:val="686D78"/>
-          <w:sz w:val="17"/>
+          <w:color w:val="13161C"/>
+          <w:sz w:val="20"/>
         </w:rPr>
-        <w:t xml:space="preserve">프로젝트의 상세 과정과 근거는 웹 포트폴리오에서 확인할 수 있습니다.  </w:t>
+        <w:t>블로그 초안 생성, 1차 검수 스킬, 직접 수정·2차 검수, 발행, SEO 피드백을 하나의 반복 흐름으로 구성</w:t>
       </w:r>
-      <w:hyperlink r:id="rId12">
-        <w:r>
-          <w:rPr>
-            <w:rFonts w:ascii="Malgun Gothic" w:hAnsi="Malgun Gothic" w:eastAsia="Malgun Gothic"/>
-            <w:color w:val="3264F5"/>
-            <w:sz w:val="17"/>
-            <w:szCs w:val="17"/>
-          </w:rPr>
-          <w:t>lim-so-hee.github.io  ↗</w:t>
-        </w:r>
-      </w:hyperlink>
+    </w:p>
+    <w:p>
+      <w:pPr>
+        <w:pStyle w:val="ListBullet"/>
+        <w:keepLines/>
+      </w:pPr>
+      <w:r>
+        <w:rPr>
+          <w:rFonts w:ascii="Malgun Gothic" w:hAnsi="Malgun Gothic" w:eastAsia="Malgun Gothic"/>
+          <w:color w:val="13161C"/>
+          <w:sz w:val="20"/>
+        </w:rPr>
+        <w:t>2026.07.31 기준 추적 키워드 10개 모두 검색 노출, 9개 5위 이내, 5개 1위</w:t>
+      </w:r>
+    </w:p>
+    <w:p>
+      <w:pPr>
+        <w:keepNext/>
+        <w:spacing w:before="400" w:after="140"/>
+      </w:pPr>
+      <w:r>
+        <w:rPr>
+          <w:rFonts w:ascii="Malgun Gothic" w:hAnsi="Malgun Gothic" w:eastAsia="Malgun Gothic"/>
+          <w:b/>
+          <w:color w:val="3264F5"/>
+          <w:sz w:val="21"/>
+        </w:rPr>
+        <w:t xml:space="preserve">02  </w:t>
+      </w:r>
+      <w:r>
+        <w:rPr>
+          <w:rFonts w:ascii="Malgun Gothic" w:hAnsi="Malgun Gothic" w:eastAsia="Malgun Gothic"/>
+          <w:b/>
+          <w:color w:val="13161C"/>
+          <w:sz w:val="23"/>
+        </w:rPr>
+        <w:t>수출바우처 사업계획서</w:t>
+      </w:r>
+    </w:p>
+    <w:p>
+      <w:pPr>
+        <w:pStyle w:val="ListBullet"/>
+        <w:keepLines/>
+      </w:pPr>
+      <w:r>
+        <w:rPr>
+          <w:rFonts w:ascii="Malgun Gothic" w:hAnsi="Malgun Gothic" w:eastAsia="Malgun Gothic"/>
+          <w:color w:val="13161C"/>
+          <w:sz w:val="20"/>
+        </w:rPr>
+        <w:t>AI로 조사 자료를 정리하고 시장 환경, 회사 역량, 수출 목표와 실행 계획이 연결되도록 구조 설계</w:t>
+      </w:r>
+    </w:p>
+    <w:p>
+      <w:pPr>
+        <w:pStyle w:val="ListBullet"/>
+        <w:keepLines/>
+      </w:pPr>
+      <w:r>
+        <w:rPr>
+          <w:rFonts w:ascii="Malgun Gothic" w:hAnsi="Malgun Gothic" w:eastAsia="Malgun Gothic"/>
+          <w:color w:val="13161C"/>
+          <w:sz w:val="20"/>
+        </w:rPr>
+        <w:t>직접 작성과 3차 개정을 거쳐 2026년 1차 수출바우처 선정, 총 4,500만 원 규모 마케팅 계획 수립</w:t>
+      </w:r>
+    </w:p>
+    <w:p>
+      <w:pPr>
+        <w:keepNext/>
+        <w:spacing w:before="400" w:after="140"/>
+      </w:pPr>
+      <w:r>
+        <w:rPr>
+          <w:rFonts w:ascii="Malgun Gothic" w:hAnsi="Malgun Gothic" w:eastAsia="Malgun Gothic"/>
+          <w:b/>
+          <w:color w:val="3264F5"/>
+          <w:sz w:val="21"/>
+        </w:rPr>
+        <w:t xml:space="preserve">03  </w:t>
+      </w:r>
+      <w:r>
+        <w:rPr>
+          <w:rFonts w:ascii="Malgun Gothic" w:hAnsi="Malgun Gothic" w:eastAsia="Malgun Gothic"/>
+          <w:b/>
+          <w:color w:val="13161C"/>
+          <w:sz w:val="23"/>
+        </w:rPr>
+        <w:t>HP 공동 웨비나</w:t>
+      </w:r>
+    </w:p>
+    <w:p>
+      <w:pPr>
+        <w:pStyle w:val="ListBullet"/>
+        <w:keepLines/>
+      </w:pPr>
+      <w:r>
+        <w:rPr>
+          <w:rFonts w:ascii="Malgun Gothic" w:hAnsi="Malgun Gothic" w:eastAsia="Malgun Gothic"/>
+          <w:color w:val="13161C"/>
+          <w:sz w:val="20"/>
+        </w:rPr>
+        <w:t>제조 현장의 문제와 3D 프린팅 적용 사례가 이어지도록 더프라임그룹 발표 섹션 구성·디자인</w:t>
+      </w:r>
+    </w:p>
+    <w:p>
+      <w:pPr>
+        <w:pStyle w:val="ListBullet"/>
+        <w:keepLines/>
+      </w:pPr>
+      <w:r>
+        <w:rPr>
+          <w:rFonts w:ascii="Malgun Gothic" w:hAnsi="Malgun Gothic" w:eastAsia="Malgun Gothic"/>
+          <w:color w:val="13161C"/>
+          <w:sz w:val="20"/>
+        </w:rPr>
+        <w:t>230명 등록, 약 170명 실시간 참석, 후속 신청 37건</w:t>
+      </w:r>
+    </w:p>
+    <w:p>
+      <w:pPr>
+        <w:keepNext/>
+        <w:spacing w:before="400" w:after="140"/>
+      </w:pPr>
+      <w:r>
+        <w:rPr>
+          <w:rFonts w:ascii="Malgun Gothic" w:hAnsi="Malgun Gothic" w:eastAsia="Malgun Gothic"/>
+          <w:b/>
+          <w:color w:val="3264F5"/>
+          <w:sz w:val="21"/>
+        </w:rPr>
+        <w:t xml:space="preserve">04  </w:t>
+      </w:r>
+      <w:r>
+        <w:rPr>
+          <w:rFonts w:ascii="Malgun Gothic" w:hAnsi="Malgun Gothic" w:eastAsia="Malgun Gothic"/>
+          <w:b/>
+          <w:color w:val="13161C"/>
+          <w:sz w:val="23"/>
+        </w:rPr>
+        <w:t>KOREA MAT 전시</w:t>
+      </w:r>
+    </w:p>
+    <w:p>
+      <w:pPr>
+        <w:pStyle w:val="ListBullet"/>
+        <w:keepLines/>
+      </w:pPr>
+      <w:r>
+        <w:rPr>
+          <w:rFonts w:ascii="Malgun Gothic" w:hAnsi="Malgun Gothic" w:eastAsia="Malgun Gothic"/>
+          <w:color w:val="13161C"/>
+          <w:sz w:val="20"/>
+        </w:rPr>
+        <w:t>AMR 시연과 상담이 이어지도록 부스 공간, 상영 영상, 현장 콘텐츠 기획</w:t>
+      </w:r>
+    </w:p>
+    <w:p>
+      <w:pPr>
+        <w:pStyle w:val="ListBullet"/>
+        <w:keepLines/>
+      </w:pPr>
+      <w:r>
+        <w:rPr>
+          <w:rFonts w:ascii="Malgun Gothic" w:hAnsi="Malgun Gothic" w:eastAsia="Malgun Gothic"/>
+          <w:color w:val="13161C"/>
+          <w:sz w:val="20"/>
+        </w:rPr>
+        <w:t>외부 제작 일정과 구현 결과를 확인하고 직접 촬영·편집한 영상을 현장에서 상영</w:t>
+      </w:r>
+    </w:p>
+    <w:p>
+      <w:pPr>
+        <w:pStyle w:val="Heading1"/>
+        <w:pageBreakBefore w:val="0"/>
+      </w:pPr>
+      <w:r>
+        <w:rPr>
+          <w:rFonts w:ascii="Malgun Gothic" w:hAnsi="Malgun Gothic" w:eastAsia="Malgun Gothic"/>
+          <w:b/>
+          <w:color w:val="3264F5"/>
+          <w:sz w:val="25"/>
+        </w:rPr>
+        <w:t>EDUCATION &amp; TRAINING</w:t>
+      </w:r>
+    </w:p>
+    <w:p>
+      <w:pPr>
+        <w:keepNext/>
+        <w:tabs>
+          <w:tab w:pos="9694" w:val="right"/>
+        </w:tabs>
+        <w:spacing w:before="280" w:after="120"/>
+      </w:pPr>
+      <w:r>
+        <w:rPr>
+          <w:rFonts w:ascii="Malgun Gothic" w:hAnsi="Malgun Gothic" w:eastAsia="Malgun Gothic"/>
+          <w:b/>
+          <w:color w:val="13161C"/>
+          <w:sz w:val="22"/>
+        </w:rPr>
+        <w:t>SBS컴퓨터아카데미 | 스마트기기 UI/UX 웹디자인 양성과정</w:t>
+      </w:r>
+      <w:r>
+        <w:rPr>
+          <w:rFonts w:ascii="Malgun Gothic" w:hAnsi="Malgun Gothic" w:eastAsia="Malgun Gothic"/>
+          <w:b/>
+          <w:color w:val="646872"/>
+          <w:sz w:val="19"/>
+        </w:rPr>
+        <w:tab/>
+        <w:t>2020.06–2020.12</w:t>
+      </w:r>
+    </w:p>
+    <w:p>
+      <w:pPr>
+        <w:keepNext/>
+        <w:tabs>
+          <w:tab w:pos="9694" w:val="right"/>
+        </w:tabs>
+        <w:spacing w:before="280" w:after="120"/>
+      </w:pPr>
+      <w:r>
+        <w:rPr>
+          <w:rFonts w:ascii="Malgun Gothic" w:hAnsi="Malgun Gothic" w:eastAsia="Malgun Gothic"/>
+          <w:b/>
+          <w:color w:val="13161C"/>
+          <w:sz w:val="22"/>
+        </w:rPr>
+        <w:t>수성대학교 | 호텔조리과 졸업</w:t>
+      </w:r>
+      <w:r>
+        <w:rPr>
+          <w:rFonts w:ascii="Malgun Gothic" w:hAnsi="Malgun Gothic" w:eastAsia="Malgun Gothic"/>
+          <w:b/>
+          <w:color w:val="646872"/>
+          <w:sz w:val="19"/>
+        </w:rPr>
+        <w:tab/>
+        <w:t>2008.03–2010.02</w:t>
+      </w:r>
+    </w:p>
+    <w:p>
+      <w:pPr>
+        <w:pStyle w:val="Heading1"/>
+        <w:pageBreakBefore w:val="0"/>
+      </w:pPr>
+      <w:r>
+        <w:rPr>
+          <w:rFonts w:ascii="Malgun Gothic" w:hAnsi="Malgun Gothic" w:eastAsia="Malgun Gothic"/>
+          <w:b/>
+          <w:color w:val="3264F5"/>
+          <w:sz w:val="25"/>
+        </w:rPr>
+        <w:t>TOOLS</w:t>
+      </w:r>
+    </w:p>
+    <w:p>
+      <w:pPr>
+        <w:spacing w:after="60"/>
+      </w:pPr>
+      <w:r>
+        <w:rPr>
+          <w:rFonts w:ascii="Malgun Gothic" w:hAnsi="Malgun Gothic" w:eastAsia="Malgun Gothic"/>
+          <w:b/>
+          <w:color w:val="3264F5"/>
+          <w:sz w:val="20"/>
+        </w:rPr>
+        <w:t xml:space="preserve">조사·구조화  </w:t>
+      </w:r>
+      <w:r>
+        <w:rPr>
+          <w:rFonts w:ascii="Malgun Gothic" w:hAnsi="Malgun Gothic" w:eastAsia="Malgun Gothic"/>
+          <w:color w:val="13161C"/>
+          <w:sz w:val="20"/>
+        </w:rPr>
+        <w:t>ChatGPT, Perplexity, Gemini, NotebookLM, Claude Code, Codex</w:t>
+      </w:r>
+    </w:p>
+    <w:p>
+      <w:pPr>
+        <w:spacing w:after="0"/>
+      </w:pPr>
+      <w:r>
+        <w:rPr>
+          <w:rFonts w:ascii="Malgun Gothic" w:hAnsi="Malgun Gothic" w:eastAsia="Malgun Gothic"/>
+          <w:b/>
+          <w:color w:val="3264F5"/>
+          <w:sz w:val="20"/>
+        </w:rPr>
+        <w:t xml:space="preserve">디자인·영상  </w:t>
+      </w:r>
+      <w:r>
+        <w:rPr>
+          <w:rFonts w:ascii="Malgun Gothic" w:hAnsi="Malgun Gothic" w:eastAsia="Malgun Gothic"/>
+          <w:color w:val="13161C"/>
+          <w:sz w:val="20"/>
+        </w:rPr>
+        <w:t>Photoshop, Illustrator, Figma, Premiere Pro</w:t>
+      </w:r>
     </w:p>
     <w:sectPr>
       <w:footerReference w:type="default" r:id="rId9"/>
       <w:pgSz w:w="11906" w:h="16838"/>
-      <w:pgMar w:top="850" w:right="964" w:bottom="794" w:left="964" w:header="397" w:footer="397" w:gutter="0"/>
+      <w:pgMar w:top="1020" w:right="1077" w:bottom="1020" w:left="1077" w:header="454" w:footer="454" w:gutter="0"/>
       <w:cols w:space="720"/>
       <w:docGrid w:linePitch="360"/>
     </w:sectPr>
@@ -1969,29 +863,63 @@
   <w:p>
     <w:pPr>
       <w:pStyle w:val="Footer"/>
-      <w:keepLines w:val="0"/>
-      <w:spacing w:before="0" w:after="0" w:line="276" w:lineRule="auto"/>
-      <w:jc w:val="right"/>
-    </w:pPr>
+      <w:tabs>
+        <w:tab w:pos="9694" w:val="right"/>
+      </w:tabs>
+      <w:spacing w:before="60" w:after="0"/>
+      <w:jc w:val="left"/>
+    </w:pPr>
+    <w:hyperlink r:id="rId1">
+      <w:r>
+        <w:rPr>
+          <w:rFonts w:ascii="Malgun Gothic" w:hAnsi="Malgun Gothic" w:eastAsia="Malgun Gothic"/>
+          <w:color w:val="3264F5"/>
+          <w:sz w:val="17"/>
+          <w:szCs w:val="17"/>
+          <w:b/>
+        </w:rPr>
+        <w:t>웹 포트폴리오에서 프로젝트 전체 보기 ↗  lim-so-hee.github.io</w:t>
+      </w:r>
+    </w:hyperlink>
     <w:r>
       <w:rPr>
-        <w:rFonts w:ascii="Arial" w:hAnsi="Arial" w:eastAsia="Arial"/>
-        <w:b w:val="0"/>
-        <w:i w:val="0"/>
-        <w:color w:val="686D78"/>
-        <w:sz w:val="15"/>
-      </w:rPr>
-      <w:t xml:space="preserve">IM SOHEE  ·  CONTENT STRATEGY &amp; OPERATIONS  ·  </w:t>
+        <w:rFonts w:ascii="Malgun Gothic" w:hAnsi="Malgun Gothic" w:eastAsia="Malgun Gothic"/>
+        <w:color w:val="646872"/>
+        <w:sz w:val="17"/>
+      </w:rPr>
+      <w:tab/>
     </w:r>
     <w:r>
       <w:rPr>
-        <w:rFonts w:ascii="Arial" w:hAnsi="Arial" w:eastAsia="Arial"/>
-        <w:b w:val="0"/>
-        <w:i w:val="0"/>
-        <w:color w:val="686D78"/>
-        <w:sz w:val="15"/>
-      </w:rPr>
-      <w:t>RESUME</w:t>
+        <w:rFonts w:ascii="Malgun Gothic" w:hAnsi="Malgun Gothic" w:eastAsia="Malgun Gothic"/>
+        <w:color w:val="646872"/>
+        <w:sz w:val="17"/>
+      </w:rPr>
+      <w:fldChar w:fldCharType="begin"/>
+      <w:instrText xml:space="preserve">PAGE</w:instrText>
+      <w:fldChar w:fldCharType="separate"/>
+      <w:t>1</w:t>
+      <w:fldChar w:fldCharType="end"/>
+    </w:r>
+    <w:r>
+      <w:rPr>
+        <w:rFonts w:ascii="Malgun Gothic" w:hAnsi="Malgun Gothic" w:eastAsia="Malgun Gothic"/>
+        <w:color w:val="646872"/>
+        <w:sz w:val="17"/>
+      </w:rPr>
+      <w:t xml:space="preserve"> / </w:t>
+    </w:r>
+    <w:r>
+      <w:rPr>
+        <w:rFonts w:ascii="Malgun Gothic" w:hAnsi="Malgun Gothic" w:eastAsia="Malgun Gothic"/>
+        <w:color w:val="646872"/>
+        <w:sz w:val="17"/>
+      </w:rPr>
+      <w:fldChar w:fldCharType="begin"/>
+      <w:instrText xml:space="preserve">NUMPAGES</w:instrText>
+      <w:fldChar w:fldCharType="separate"/>
+      <w:t>1</w:t>
+      <w:fldChar w:fldCharType="end"/>
     </w:r>
   </w:p>
 </w:ftr>
@@ -2361,12 +1289,12 @@
     <w:qFormat/>
     <w:rsid w:val="00FC693F"/>
     <w:pPr>
-      <w:spacing w:after="80" w:line="276" w:lineRule="auto"/>
+      <w:spacing w:before="0" w:after="140" w:line="324" w:lineRule="auto"/>
     </w:pPr>
     <w:rPr>
       <w:rFonts w:ascii="Malgun Gothic" w:hAnsi="Malgun Gothic" w:eastAsia="Malgun Gothic"/>
-      <w:color w:val="111318"/>
-      <w:sz w:val="19"/>
+      <w:color w:val="13161C"/>
+      <w:sz w:val="21"/>
     </w:rPr>
   </w:style>
   <w:style w:type="paragraph" w:styleId="Header">
@@ -2424,7 +1352,7 @@
     <w:pPr>
       <w:keepNext/>
       <w:keepLines/>
-      <w:spacing w:before="200" w:after="120"/>
+      <w:spacing w:before="480" w:after="220"/>
       <w:outlineLvl w:val="0"/>
     </w:pPr>
     <w:rPr>
@@ -2432,7 +1360,7 @@
       <w:b/>
       <w:bCs/>
       <w:color w:val="3264F5"/>
-      <w:sz w:val="32"/>
+      <w:sz w:val="25"/>
       <w:szCs w:val="28"/>
     </w:rPr>
   </w:style>
@@ -2448,15 +1376,15 @@
     <w:pPr>
       <w:keepNext/>
       <w:keepLines/>
-      <w:spacing w:before="160" w:after="80"/>
+      <w:spacing w:before="300" w:after="120"/>
       <w:outlineLvl w:val="1"/>
     </w:pPr>
     <w:rPr>
       <w:rFonts w:asciiTheme="majorHAnsi" w:eastAsiaTheme="majorEastAsia" w:hAnsiTheme="majorHAnsi" w:cstheme="majorBidi" w:ascii="Malgun Gothic" w:hAnsi="Malgun Gothic" w:eastAsia="Malgun Gothic"/>
       <w:b/>
       <w:bCs/>
-      <w:color w:val="111318"/>
-      <w:sz w:val="25"/>
+      <w:color w:val="13161C"/>
+      <w:sz w:val="23"/>
       <w:szCs w:val="26"/>
     </w:rPr>
   </w:style>
@@ -2472,14 +1400,14 @@
     <w:pPr>
       <w:keepNext/>
       <w:keepLines/>
-      <w:spacing w:before="120" w:after="60"/>
+      <w:spacing w:before="200" w:after="80"/>
       <w:outlineLvl w:val="2"/>
     </w:pPr>
     <w:rPr>
       <w:rFonts w:asciiTheme="majorHAnsi" w:eastAsiaTheme="majorEastAsia" w:hAnsiTheme="majorHAnsi" w:cstheme="majorBidi" w:ascii="Malgun Gothic" w:hAnsi="Malgun Gothic" w:eastAsia="Malgun Gothic"/>
       <w:b/>
       <w:bCs/>
-      <w:color w:val="111318"/>
+      <w:color w:val="13161C"/>
       <w:sz w:val="21"/>
     </w:rPr>
   </w:style>
@@ -2896,8 +1824,14 @@
       <w:numPr>
         <w:numId w:val="1"/>
       </w:numPr>
+      <w:spacing w:after="130" w:line="324" w:lineRule="auto"/>
+      <w:ind w:left="329" w:hanging="181"/>
       <w:contextualSpacing/>
     </w:pPr>
+    <w:rPr>
+      <w:rFonts w:ascii="Malgun Gothic" w:hAnsi="Malgun Gothic" w:eastAsia="Malgun Gothic"/>
+      <w:sz w:val="20"/>
+    </w:rPr>
   </w:style>
   <w:style w:type="paragraph" w:styleId="ListBullet2">
     <w:name w:val="List Bullet 2"/>
@@ -14051,6 +12985,17 @@
         <w:shd w:val="clear" w:color="auto" w:fill="FBCAA2" w:themeFill="accent6" w:themeFillTint="7F"/>
       </w:tcPr>
     </w:tblStylePr>
+  </w:style>
+  <w:style w:type="paragraph" w:customStyle="1" w:styleId="ResumeMeta">
+    <w:name w:val="Resume Meta"/>
+    <w:pPr>
+      <w:spacing w:after="80" w:line="288" w:lineRule="auto"/>
+    </w:pPr>
+    <w:rPr>
+      <w:rFonts w:ascii="Malgun Gothic" w:hAnsi="Malgun Gothic" w:eastAsia="Malgun Gothic"/>
+      <w:color w:val="646872"/>
+      <w:sz w:val="18"/>
+    </w:rPr>
   </w:style>
 </w:styles>
 </file>

</xml_diff>